<commit_message>
Align resume experience bullets with Python/UI Developer responsibilities
Co-Authored-By: Claude Opus 5.5 <noreply@anthropic.com>
Claude-Session: https://claude.ai/code/session_013uu8YLK93nR2ygpNvDWsMr
</commit_message>
<xml_diff>
--- a/resume/Ritesh_Somashekar_Python_UI_Developer.docx
+++ b/resume/Ritesh_Somashekar_Python_UI_Developer.docx
@@ -783,7 +783,7 @@
           <w:i w:val="0"/>
           <w:sz w:val="22"/>
         </w:rPr>
-        <w:t xml:space="preserve">Modernized the UI architecture of a </w:t>
+        <w:t xml:space="preserve">Modernized the </w:t>
       </w:r>
       <w:r>
         <w:rPr>
@@ -791,7 +791,7 @@
           <w:i w:val="0"/>
           <w:sz w:val="22"/>
         </w:rPr>
-        <w:t>multi-user research analytics dashboard</w:t>
+        <w:t>UI architecture</w:t>
       </w:r>
       <w:r>
         <w:rPr>
@@ -799,7 +799,7 @@
           <w:i w:val="0"/>
           <w:sz w:val="22"/>
         </w:rPr>
-        <w:t xml:space="preserve"> using </w:t>
+        <w:t xml:space="preserve"> of a multi-user research analytics platform through a full redesign in </w:t>
       </w:r>
       <w:r>
         <w:rPr>
@@ -831,7 +831,7 @@
           <w:i w:val="0"/>
           <w:sz w:val="22"/>
         </w:rPr>
-        <w:t xml:space="preserve">, redesigning </w:t>
+        <w:t xml:space="preserve">, improving </w:t>
       </w:r>
       <w:r>
         <w:rPr>
@@ -839,7 +839,7 @@
           <w:i w:val="0"/>
           <w:sz w:val="22"/>
         </w:rPr>
-        <w:t>information hierarchy, navigation, and layout</w:t>
+        <w:t>information hierarchy, usability, consistency, and layout</w:t>
       </w:r>
       <w:r>
         <w:rPr>
@@ -847,7 +847,7 @@
           <w:i w:val="0"/>
           <w:sz w:val="22"/>
         </w:rPr>
-        <w:t xml:space="preserve"> across functional modules to improve usability and consistency.</w:t>
+        <w:t xml:space="preserve"> across functional modules (data ingestion, job monitoring, results, and administration).</w:t>
       </w:r>
     </w:p>
     <w:p>
@@ -872,7 +872,23 @@
           <w:i w:val="0"/>
           <w:sz w:val="22"/>
         </w:rPr>
-        <w:t xml:space="preserve">Built a reusable </w:t>
+        <w:t xml:space="preserve">Designed and developed </w:t>
+      </w:r>
+      <w:r>
+        <w:rPr>
+          <w:b/>
+          <w:i w:val="0"/>
+          <w:sz w:val="22"/>
+        </w:rPr>
+        <w:t>modern, scalable web user interfaces</w:t>
+      </w:r>
+      <w:r>
+        <w:rPr>
+          <w:b w:val="0"/>
+          <w:i w:val="0"/>
+          <w:sz w:val="22"/>
+        </w:rPr>
+        <w:t xml:space="preserve"> backed by a reusable </w:t>
       </w:r>
       <w:r>
         <w:rPr>
@@ -888,7 +904,7 @@
           <w:i w:val="0"/>
           <w:sz w:val="22"/>
         </w:rPr>
-        <w:t xml:space="preserve"> (typography, spacing, interaction states) applying </w:t>
+        <w:t xml:space="preserve">, applying </w:t>
       </w:r>
       <w:r>
         <w:rPr>
@@ -920,226 +936,7 @@
           <w:i w:val="0"/>
           <w:sz w:val="22"/>
         </w:rPr>
-        <w:t xml:space="preserve"> practices, standardizing UI patterns across all dashboard views.</w:t>
-      </w:r>
-    </w:p>
-    <w:p>
-      <w:pPr>
-        <w:tabs>
-          <w:tab w:pos="475" w:val="left"/>
-        </w:tabs>
-        <w:spacing w:after="20"/>
-        <w:ind w:left="475" w:hanging="331"/>
-        <w:jc w:val="both"/>
-      </w:pPr>
-      <w:r>
-        <w:rPr>
-          <w:sz w:val="22"/>
-        </w:rPr>
-        <w:t>•</w:t>
-        <w:tab/>
-      </w:r>
-      <w:r>
-        <w:rPr>
-          <w:b w:val="0"/>
-          <w:i w:val="0"/>
-          <w:sz w:val="22"/>
-        </w:rPr>
-        <w:t xml:space="preserve">Implemented </w:t>
-      </w:r>
-      <w:r>
-        <w:rPr>
-          <w:b/>
-          <w:i w:val="0"/>
-          <w:sz w:val="22"/>
-        </w:rPr>
-        <w:t>role-based access control (RBAC)</w:t>
-      </w:r>
-      <w:r>
-        <w:rPr>
-          <w:b w:val="0"/>
-          <w:i w:val="0"/>
-          <w:sz w:val="22"/>
-        </w:rPr>
-        <w:t xml:space="preserve"> and token-based </w:t>
-      </w:r>
-      <w:r>
-        <w:rPr>
-          <w:b/>
-          <w:i w:val="0"/>
-          <w:sz w:val="22"/>
-        </w:rPr>
-        <w:t>authorization</w:t>
-      </w:r>
-      <w:r>
-        <w:rPr>
-          <w:b w:val="0"/>
-          <w:i w:val="0"/>
-          <w:sz w:val="22"/>
-        </w:rPr>
-        <w:t xml:space="preserve"> on </w:t>
-      </w:r>
-      <w:r>
-        <w:rPr>
-          <w:b/>
-          <w:i w:val="0"/>
-          <w:sz w:val="22"/>
-        </w:rPr>
-        <w:t>FastAPI</w:t>
-      </w:r>
-      <w:r>
-        <w:rPr>
-          <w:b w:val="0"/>
-          <w:i w:val="0"/>
-          <w:sz w:val="22"/>
-        </w:rPr>
-        <w:t xml:space="preserve"> endpoints, securing multi-user access to datasets, models, and results by role and project.</w:t>
-      </w:r>
-    </w:p>
-    <w:p>
-      <w:pPr>
-        <w:tabs>
-          <w:tab w:pos="475" w:val="left"/>
-        </w:tabs>
-        <w:spacing w:after="20"/>
-        <w:ind w:left="475" w:hanging="331"/>
-        <w:jc w:val="both"/>
-      </w:pPr>
-      <w:r>
-        <w:rPr>
-          <w:sz w:val="22"/>
-        </w:rPr>
-        <w:t>•</w:t>
-        <w:tab/>
-      </w:r>
-      <w:r>
-        <w:rPr>
-          <w:b w:val="0"/>
-          <w:i w:val="0"/>
-          <w:sz w:val="22"/>
-        </w:rPr>
-        <w:t xml:space="preserve">Designed a </w:t>
-      </w:r>
-      <w:r>
-        <w:rPr>
-          <w:b/>
-          <w:i w:val="0"/>
-          <w:sz w:val="22"/>
-        </w:rPr>
-        <w:t>job queuing and scheduling</w:t>
-      </w:r>
-      <w:r>
-        <w:rPr>
-          <w:b w:val="0"/>
-          <w:i w:val="0"/>
-          <w:sz w:val="22"/>
-        </w:rPr>
-        <w:t xml:space="preserve"> layer for long-running processing jobs over </w:t>
-      </w:r>
-      <w:r>
-        <w:rPr>
-          <w:b/>
-          <w:i w:val="0"/>
-          <w:sz w:val="22"/>
-        </w:rPr>
-        <w:t>30K+ documents</w:t>
-      </w:r>
-      <w:r>
-        <w:rPr>
-          <w:b w:val="0"/>
-          <w:i w:val="0"/>
-          <w:sz w:val="22"/>
-        </w:rPr>
-        <w:t xml:space="preserve">, supporting </w:t>
-      </w:r>
-      <w:r>
-        <w:rPr>
-          <w:b/>
-          <w:i w:val="0"/>
-          <w:sz w:val="22"/>
-        </w:rPr>
-        <w:t>concurrent execution, prioritization</w:t>
-      </w:r>
-      <w:r>
-        <w:rPr>
-          <w:b w:val="0"/>
-          <w:i w:val="0"/>
-          <w:sz w:val="22"/>
-        </w:rPr>
-        <w:t>, and real-time job-status tracking surfaced in the UI.</w:t>
-      </w:r>
-    </w:p>
-    <w:p>
-      <w:pPr>
-        <w:tabs>
-          <w:tab w:pos="475" w:val="left"/>
-        </w:tabs>
-        <w:spacing w:after="20"/>
-        <w:ind w:left="475" w:hanging="331"/>
-        <w:jc w:val="both"/>
-      </w:pPr>
-      <w:r>
-        <w:rPr>
-          <w:sz w:val="22"/>
-        </w:rPr>
-        <w:t>•</w:t>
-        <w:tab/>
-      </w:r>
-      <w:r>
-        <w:rPr>
-          <w:b w:val="0"/>
-          <w:i w:val="0"/>
-          <w:sz w:val="22"/>
-        </w:rPr>
-        <w:t xml:space="preserve">Profiled and optimized end-to-end </w:t>
-      </w:r>
-      <w:r>
-        <w:rPr>
-          <w:b/>
-          <w:i w:val="0"/>
-          <w:sz w:val="22"/>
-        </w:rPr>
-        <w:t>run-processing pipelines</w:t>
-      </w:r>
-      <w:r>
-        <w:rPr>
-          <w:b w:val="0"/>
-          <w:i w:val="0"/>
-          <w:sz w:val="22"/>
-        </w:rPr>
-        <w:t xml:space="preserve"> using </w:t>
-      </w:r>
-      <w:r>
-        <w:rPr>
-          <w:b/>
-          <w:i w:val="0"/>
-          <w:sz w:val="22"/>
-        </w:rPr>
-        <w:t>Python, PyTorch, MLflow, and Optuna</w:t>
-      </w:r>
-      <w:r>
-        <w:rPr>
-          <w:b w:val="0"/>
-          <w:i w:val="0"/>
-          <w:sz w:val="22"/>
-        </w:rPr>
-        <w:t xml:space="preserve">, cutting iteration cycles from </w:t>
-      </w:r>
-      <w:r>
-        <w:rPr>
-          <w:b/>
-          <w:i w:val="0"/>
-          <w:sz w:val="22"/>
-        </w:rPr>
-        <w:t>3 days to under 18 hours</w:t>
-      </w:r>
-      <w:r>
-        <w:rPr>
-          <w:b w:val="0"/>
-          <w:i w:val="0"/>
-          <w:sz w:val="22"/>
-        </w:rPr>
-        <w:t xml:space="preserve"> and serving predictions to the UI with </w:t>
+        <w:t xml:space="preserve"> standards and serving data to the UI with </w:t>
       </w:r>
       <w:r>
         <w:rPr>
@@ -1180,7 +977,7 @@
           <w:i w:val="0"/>
           <w:sz w:val="22"/>
         </w:rPr>
-        <w:t xml:space="preserve">Streamlined data-preparation workflows with </w:t>
+        <w:t xml:space="preserve">Enhanced </w:t>
       </w:r>
       <w:r>
         <w:rPr>
@@ -1188,7 +985,7 @@
           <w:i w:val="0"/>
           <w:sz w:val="22"/>
         </w:rPr>
-        <w:t>Pandas</w:t>
+        <w:t>access control and authorization</w:t>
       </w:r>
       <w:r>
         <w:rPr>
@@ -1196,7 +993,7 @@
           <w:i w:val="0"/>
           <w:sz w:val="22"/>
         </w:rPr>
-        <w:t xml:space="preserve"> and </w:t>
+        <w:t xml:space="preserve"> by implementing </w:t>
       </w:r>
       <w:r>
         <w:rPr>
@@ -1204,7 +1001,169 @@
           <w:i w:val="0"/>
           <w:sz w:val="22"/>
         </w:rPr>
-        <w:t>Scikit-learn</w:t>
+        <w:t>role-based access control (RBAC)</w:t>
+      </w:r>
+      <w:r>
+        <w:rPr>
+          <w:b w:val="0"/>
+          <w:i w:val="0"/>
+          <w:sz w:val="22"/>
+        </w:rPr>
+        <w:t xml:space="preserve"> and token-based (</w:t>
+      </w:r>
+      <w:r>
+        <w:rPr>
+          <w:b/>
+          <w:i w:val="0"/>
+          <w:sz w:val="22"/>
+        </w:rPr>
+        <w:t>JWT</w:t>
+      </w:r>
+      <w:r>
+        <w:rPr>
+          <w:b w:val="0"/>
+          <w:i w:val="0"/>
+          <w:sz w:val="22"/>
+        </w:rPr>
+        <w:t>) authentication on FastAPI endpoints, enforcing role- and project-level permissions for datasets, jobs, and results.</w:t>
+      </w:r>
+    </w:p>
+    <w:p>
+      <w:pPr>
+        <w:tabs>
+          <w:tab w:pos="475" w:val="left"/>
+        </w:tabs>
+        <w:spacing w:after="20"/>
+        <w:ind w:left="475" w:hanging="331"/>
+        <w:jc w:val="both"/>
+      </w:pPr>
+      <w:r>
+        <w:rPr>
+          <w:sz w:val="22"/>
+        </w:rPr>
+        <w:t>•</w:t>
+        <w:tab/>
+      </w:r>
+      <w:r>
+        <w:rPr>
+          <w:b w:val="0"/>
+          <w:i w:val="0"/>
+          <w:sz w:val="22"/>
+        </w:rPr>
+        <w:t xml:space="preserve">Built </w:t>
+      </w:r>
+      <w:r>
+        <w:rPr>
+          <w:b/>
+          <w:i w:val="0"/>
+          <w:sz w:val="22"/>
+        </w:rPr>
+        <w:t>job queuing and scheduling</w:t>
+      </w:r>
+      <w:r>
+        <w:rPr>
+          <w:b w:val="0"/>
+          <w:i w:val="0"/>
+          <w:sz w:val="22"/>
+        </w:rPr>
+        <w:t xml:space="preserve"> for long-running compute jobs (NLP runs over </w:t>
+      </w:r>
+      <w:r>
+        <w:rPr>
+          <w:b/>
+          <w:i w:val="0"/>
+          <w:sz w:val="22"/>
+        </w:rPr>
+        <w:t>30K+ documents</w:t>
+      </w:r>
+      <w:r>
+        <w:rPr>
+          <w:b w:val="0"/>
+          <w:i w:val="0"/>
+          <w:sz w:val="22"/>
+        </w:rPr>
+        <w:t xml:space="preserve">) on the </w:t>
+      </w:r>
+      <w:r>
+        <w:rPr>
+          <w:b/>
+          <w:i w:val="0"/>
+          <w:sz w:val="22"/>
+        </w:rPr>
+        <w:t>ORC Hopper HPC cluster</w:t>
+      </w:r>
+      <w:r>
+        <w:rPr>
+          <w:b w:val="0"/>
+          <w:i w:val="0"/>
+          <w:sz w:val="22"/>
+        </w:rPr>
+        <w:t xml:space="preserve">, supporting </w:t>
+      </w:r>
+      <w:r>
+        <w:rPr>
+          <w:b/>
+          <w:i w:val="0"/>
+          <w:sz w:val="22"/>
+        </w:rPr>
+        <w:t>concurrent execution, priority-based dispatching, and efficient resource allocation</w:t>
+      </w:r>
+      <w:r>
+        <w:rPr>
+          <w:b w:val="0"/>
+          <w:i w:val="0"/>
+          <w:sz w:val="22"/>
+        </w:rPr>
+        <w:t>.</w:t>
+      </w:r>
+    </w:p>
+    <w:p>
+      <w:pPr>
+        <w:tabs>
+          <w:tab w:pos="475" w:val="left"/>
+        </w:tabs>
+        <w:spacing w:after="20"/>
+        <w:ind w:left="475" w:hanging="331"/>
+        <w:jc w:val="both"/>
+      </w:pPr>
+      <w:r>
+        <w:rPr>
+          <w:sz w:val="22"/>
+        </w:rPr>
+        <w:t>•</w:t>
+        <w:tab/>
+      </w:r>
+      <w:r>
+        <w:rPr>
+          <w:b w:val="0"/>
+          <w:i w:val="0"/>
+          <w:sz w:val="22"/>
+        </w:rPr>
+        <w:t xml:space="preserve">Streamlined </w:t>
+      </w:r>
+      <w:r>
+        <w:rPr>
+          <w:b/>
+          <w:i w:val="0"/>
+          <w:sz w:val="22"/>
+        </w:rPr>
+        <w:t>end-to-end workflows</w:t>
+      </w:r>
+      <w:r>
+        <w:rPr>
+          <w:b w:val="0"/>
+          <w:i w:val="0"/>
+          <w:sz w:val="22"/>
+        </w:rPr>
+        <w:t xml:space="preserve"> by identifying bottlenecks in data-preparation and training stages and </w:t>
+      </w:r>
+      <w:r>
+        <w:rPr>
+          <w:b/>
+          <w:i w:val="0"/>
+          <w:sz w:val="22"/>
+        </w:rPr>
+        <w:t>refactoring orchestration logic</w:t>
       </w:r>
       <w:r>
         <w:rPr>
@@ -1228,7 +1187,7 @@
           <w:i w:val="0"/>
           <w:sz w:val="22"/>
         </w:rPr>
-        <w:t xml:space="preserve"> of structured and unstructured data across 6 datasets and reducing preparation time by </w:t>
+        <w:t xml:space="preserve"> of data across 6 datasets and reducing preparation time by </w:t>
       </w:r>
       <w:r>
         <w:rPr>
@@ -1269,7 +1228,96 @@
           <w:i w:val="0"/>
           <w:sz w:val="22"/>
         </w:rPr>
-        <w:t xml:space="preserve">Containerized services with </w:t>
+        <w:t xml:space="preserve">Analyzed </w:t>
+      </w:r>
+      <w:r>
+        <w:rPr>
+          <w:b/>
+          <w:i w:val="0"/>
+          <w:sz w:val="22"/>
+        </w:rPr>
+        <w:t>run-processing pipelines</w:t>
+      </w:r>
+      <w:r>
+        <w:rPr>
+          <w:b w:val="0"/>
+          <w:i w:val="0"/>
+          <w:sz w:val="22"/>
+        </w:rPr>
+        <w:t xml:space="preserve">, developed </w:t>
+      </w:r>
+      <w:r>
+        <w:rPr>
+          <w:b/>
+          <w:i w:val="0"/>
+          <w:sz w:val="22"/>
+        </w:rPr>
+        <w:t>performance metrics and statistics</w:t>
+      </w:r>
+      <w:r>
+        <w:rPr>
+          <w:b w:val="0"/>
+          <w:i w:val="0"/>
+          <w:sz w:val="22"/>
+        </w:rPr>
+        <w:t xml:space="preserve"> (runtime, queue wait, throughput) with </w:t>
+      </w:r>
+      <w:r>
+        <w:rPr>
+          <w:b/>
+          <w:i w:val="0"/>
+          <w:sz w:val="22"/>
+        </w:rPr>
+        <w:t>MLflow</w:t>
+      </w:r>
+      <w:r>
+        <w:rPr>
+          <w:b w:val="0"/>
+          <w:i w:val="0"/>
+          <w:sz w:val="22"/>
+        </w:rPr>
+        <w:t xml:space="preserve">, and applied optimization strategies that cut iteration cycles from </w:t>
+      </w:r>
+      <w:r>
+        <w:rPr>
+          <w:b/>
+          <w:i w:val="0"/>
+          <w:sz w:val="22"/>
+        </w:rPr>
+        <w:t>3 days to under 18 hours</w:t>
+      </w:r>
+      <w:r>
+        <w:rPr>
+          <w:b w:val="0"/>
+          <w:i w:val="0"/>
+          <w:sz w:val="22"/>
+        </w:rPr>
+        <w:t>.</w:t>
+      </w:r>
+    </w:p>
+    <w:p>
+      <w:pPr>
+        <w:tabs>
+          <w:tab w:pos="475" w:val="left"/>
+        </w:tabs>
+        <w:spacing w:after="20"/>
+        <w:ind w:left="475" w:hanging="331"/>
+        <w:jc w:val="both"/>
+      </w:pPr>
+      <w:r>
+        <w:rPr>
+          <w:sz w:val="22"/>
+        </w:rPr>
+        <w:t>•</w:t>
+        <w:tab/>
+      </w:r>
+      <w:r>
+        <w:rPr>
+          <w:b w:val="0"/>
+          <w:i w:val="0"/>
+          <w:sz w:val="22"/>
+        </w:rPr>
+        <w:t xml:space="preserve">Containerized platform services with </w:t>
       </w:r>
       <w:r>
         <w:rPr>
@@ -1285,7 +1333,7 @@
           <w:i w:val="0"/>
           <w:sz w:val="22"/>
         </w:rPr>
-        <w:t xml:space="preserve"> and automated releases through </w:t>
+        <w:t xml:space="preserve"> and automated delivery through </w:t>
       </w:r>
       <w:r>
         <w:rPr>
@@ -1293,7 +1341,7 @@
           <w:i w:val="0"/>
           <w:sz w:val="22"/>
         </w:rPr>
-        <w:t>CI/CD</w:t>
+        <w:t>CI/CD pipelines</w:t>
       </w:r>
       <w:r>
         <w:rPr>
@@ -1301,7 +1349,7 @@
           <w:i w:val="0"/>
           <w:sz w:val="22"/>
         </w:rPr>
-        <w:t xml:space="preserve"> pipelines, reducing release cycles from </w:t>
+        <w:t xml:space="preserve">, reducing release cycles from </w:t>
       </w:r>
       <w:r>
         <w:rPr>
@@ -1333,7 +1381,7 @@
           <w:i w:val="0"/>
           <w:sz w:val="22"/>
         </w:rPr>
-        <w:t xml:space="preserve"> of UI and model variants.</w:t>
+        <w:t xml:space="preserve"> of UI and backend changes.</w:t>
       </w:r>
     </w:p>
     <w:p>
@@ -1358,7 +1406,7 @@
           <w:i w:val="0"/>
           <w:sz w:val="22"/>
         </w:rPr>
-        <w:t xml:space="preserve">Led </w:t>
+        <w:t xml:space="preserve">Collaborated in </w:t>
       </w:r>
       <w:r>
         <w:rPr>
@@ -1366,23 +1414,7 @@
           <w:i w:val="0"/>
           <w:sz w:val="22"/>
         </w:rPr>
-        <w:t>design and code reviews</w:t>
-      </w:r>
-      <w:r>
-        <w:rPr>
-          <w:b w:val="0"/>
-          <w:i w:val="0"/>
-          <w:sz w:val="22"/>
-        </w:rPr>
-        <w:t xml:space="preserve"> using </w:t>
-      </w:r>
-      <w:r>
-        <w:rPr>
-          <w:b/>
-          <w:i w:val="0"/>
-          <w:sz w:val="22"/>
-        </w:rPr>
-        <w:t>Git</w:t>
+        <w:t>technical design discussions</w:t>
       </w:r>
       <w:r>
         <w:rPr>
@@ -1398,7 +1430,7 @@
           <w:i w:val="0"/>
           <w:sz w:val="22"/>
         </w:rPr>
-        <w:t>DVC</w:t>
+        <w:t>code reviews</w:t>
       </w:r>
       <w:r>
         <w:rPr>
@@ -1406,7 +1438,7 @@
           <w:i w:val="0"/>
           <w:sz w:val="22"/>
         </w:rPr>
-        <w:t xml:space="preserve">, and authored </w:t>
+        <w:t xml:space="preserve"> (Git, DVC), and authored </w:t>
       </w:r>
       <w:r>
         <w:rPr>
@@ -1422,7 +1454,23 @@
           <w:i w:val="0"/>
           <w:sz w:val="22"/>
         </w:rPr>
-        <w:t xml:space="preserve"> and engineering best practices, reducing onboarding time for new contributors to </w:t>
+        <w:t xml:space="preserve"> and </w:t>
+      </w:r>
+      <w:r>
+        <w:rPr>
+          <w:b/>
+          <w:i w:val="0"/>
+          <w:sz w:val="22"/>
+        </w:rPr>
+        <w:t>engineering best practices</w:t>
+      </w:r>
+      <w:r>
+        <w:rPr>
+          <w:b w:val="0"/>
+          <w:i w:val="0"/>
+          <w:sz w:val="22"/>
+        </w:rPr>
+        <w:t xml:space="preserve">, reducing onboarding time for new contributors to </w:t>
       </w:r>
       <w:r>
         <w:rPr>
@@ -1498,7 +1546,7 @@
           <w:i w:val="0"/>
           <w:sz w:val="22"/>
         </w:rPr>
-        <w:t xml:space="preserve">Engineered </w:t>
+        <w:t xml:space="preserve">Designed and extended </w:t>
       </w:r>
       <w:r>
         <w:rPr>
@@ -1578,7 +1626,7 @@
           <w:i w:val="0"/>
           <w:sz w:val="22"/>
         </w:rPr>
-        <w:t xml:space="preserve"> healthcare data exchange for a U.S. healthcare client.</w:t>
+        <w:t xml:space="preserve"> data exchange for a U.S. healthcare client.</w:t>
       </w:r>
     </w:p>
     <w:p>
@@ -1603,7 +1651,7 @@
           <w:i w:val="0"/>
           <w:sz w:val="22"/>
         </w:rPr>
-        <w:t xml:space="preserve">Orchestrated end-to-end workflows with </w:t>
+        <w:t xml:space="preserve">Enhanced </w:t>
       </w:r>
       <w:r>
         <w:rPr>
@@ -1611,7 +1659,7 @@
           <w:i w:val="0"/>
           <w:sz w:val="22"/>
         </w:rPr>
-        <w:t>Apache Airflow DAGs</w:t>
+        <w:t>job scheduling and queuing</w:t>
       </w:r>
       <w:r>
         <w:rPr>
@@ -1619,7 +1667,7 @@
           <w:i w:val="0"/>
           <w:sz w:val="22"/>
         </w:rPr>
-        <w:t xml:space="preserve"> for data ingestion, transformation, and model retraining; refactored </w:t>
+        <w:t xml:space="preserve"> in </w:t>
       </w:r>
       <w:r>
         <w:rPr>
@@ -1627,7 +1675,7 @@
           <w:i w:val="0"/>
           <w:sz w:val="22"/>
         </w:rPr>
-        <w:t>scheduling and dependency logic</w:t>
+        <w:t>Apache Airflow</w:t>
       </w:r>
       <w:r>
         <w:rPr>
@@ -1635,7 +1683,7 @@
           <w:i w:val="0"/>
           <w:sz w:val="22"/>
         </w:rPr>
-        <w:t xml:space="preserve"> to support </w:t>
+        <w:t xml:space="preserve">, configuring DAG priority weights, pools, and concurrency limits to support </w:t>
       </w:r>
       <w:r>
         <w:rPr>
@@ -1643,7 +1691,7 @@
           <w:i w:val="0"/>
           <w:sz w:val="22"/>
         </w:rPr>
-        <w:t>concurrent execution and prioritization</w:t>
+        <w:t>concurrent execution, prioritization, and efficient resource allocation</w:t>
       </w:r>
       <w:r>
         <w:rPr>
@@ -1692,7 +1740,7 @@
           <w:i w:val="0"/>
           <w:sz w:val="22"/>
         </w:rPr>
-        <w:t xml:space="preserve">Profiled and optimized large-scale </w:t>
+        <w:t xml:space="preserve">Streamlined </w:t>
       </w:r>
       <w:r>
         <w:rPr>
@@ -1700,7 +1748,72 @@
           <w:i w:val="0"/>
           <w:sz w:val="22"/>
         </w:rPr>
-        <w:t>distributed processing workloads</w:t>
+        <w:t>end-to-end workflows</w:t>
+      </w:r>
+      <w:r>
+        <w:rPr>
+          <w:b w:val="0"/>
+          <w:i w:val="0"/>
+          <w:sz w:val="22"/>
+        </w:rPr>
+        <w:t xml:space="preserve"> by identifying bottlenecks and </w:t>
+      </w:r>
+      <w:r>
+        <w:rPr>
+          <w:b/>
+          <w:i w:val="0"/>
+          <w:sz w:val="22"/>
+        </w:rPr>
+        <w:t>refactoring orchestration and dependency logic</w:t>
+      </w:r>
+      <w:r>
+        <w:rPr>
+          <w:b w:val="0"/>
+          <w:i w:val="0"/>
+          <w:sz w:val="22"/>
+        </w:rPr>
+        <w:t xml:space="preserve">, improving coordination across ingestion, processing, and serving components and reducing project turnaround time by </w:t>
+      </w:r>
+      <w:r>
+        <w:rPr>
+          <w:b/>
+          <w:i w:val="0"/>
+          <w:sz w:val="22"/>
+        </w:rPr>
+        <w:t>15%</w:t>
+      </w:r>
+      <w:r>
+        <w:rPr>
+          <w:b w:val="0"/>
+          <w:i w:val="0"/>
+          <w:sz w:val="22"/>
+        </w:rPr>
+        <w:t>.</w:t>
+      </w:r>
+    </w:p>
+    <w:p>
+      <w:pPr>
+        <w:tabs>
+          <w:tab w:pos="475" w:val="left"/>
+        </w:tabs>
+        <w:spacing w:after="20"/>
+        <w:ind w:left="475" w:hanging="331"/>
+        <w:jc w:val="both"/>
+      </w:pPr>
+      <w:r>
+        <w:rPr>
+          <w:sz w:val="22"/>
+        </w:rPr>
+        <w:t>•</w:t>
+        <w:tab/>
+      </w:r>
+      <w:r>
+        <w:rPr>
+          <w:b/>
+          <w:i w:val="0"/>
+          <w:sz w:val="22"/>
+        </w:rPr>
+        <w:t>Profiled and optimized long-running distributed workloads</w:t>
       </w:r>
       <w:r>
         <w:rPr>
@@ -1724,7 +1837,7 @@
           <w:i w:val="0"/>
           <w:sz w:val="22"/>
         </w:rPr>
-        <w:t>, tuning partitioning and job execution to significantly reduce processing time and increase throughput.</w:t>
+        <w:t xml:space="preserve"> and tuning partitioning, caching, and executor resource allocation, significantly reducing processing time and increasing throughput.</w:t>
       </w:r>
     </w:p>
     <w:p>
@@ -1757,7 +1870,7 @@
           <w:i w:val="0"/>
           <w:sz w:val="22"/>
         </w:rPr>
-        <w:t>ETL pipelines</w:t>
+        <w:t>distributed data-processing pipelines</w:t>
       </w:r>
       <w:r>
         <w:rPr>
@@ -1854,7 +1967,7 @@
           <w:i w:val="0"/>
           <w:sz w:val="22"/>
         </w:rPr>
-        <w:t xml:space="preserve">Containerized and deployed Python services using </w:t>
+        <w:t xml:space="preserve">Developed </w:t>
       </w:r>
       <w:r>
         <w:rPr>
@@ -1862,7 +1975,128 @@
           <w:i w:val="0"/>
           <w:sz w:val="22"/>
         </w:rPr>
-        <w:t>Docker, Kubernetes, and Jenkins CI/CD</w:t>
+        <w:t>performance metrics and statistics</w:t>
+      </w:r>
+      <w:r>
+        <w:rPr>
+          <w:b w:val="0"/>
+          <w:i w:val="0"/>
+          <w:sz w:val="22"/>
+        </w:rPr>
+        <w:t xml:space="preserve"> dashboards using </w:t>
+      </w:r>
+      <w:r>
+        <w:rPr>
+          <w:b/>
+          <w:i w:val="0"/>
+          <w:sz w:val="22"/>
+        </w:rPr>
+        <w:t>Azure Stream Analytics</w:t>
+      </w:r>
+      <w:r>
+        <w:rPr>
+          <w:b w:val="0"/>
+          <w:i w:val="0"/>
+          <w:sz w:val="22"/>
+        </w:rPr>
+        <w:t xml:space="preserve"> and </w:t>
+      </w:r>
+      <w:r>
+        <w:rPr>
+          <w:b/>
+          <w:i w:val="0"/>
+          <w:sz w:val="22"/>
+        </w:rPr>
+        <w:t>Power BI</w:t>
+      </w:r>
+      <w:r>
+        <w:rPr>
+          <w:b w:val="0"/>
+          <w:i w:val="0"/>
+          <w:sz w:val="22"/>
+        </w:rPr>
+        <w:t xml:space="preserve"> to monitor pipeline throughput and system health, reducing unplanned downtime by </w:t>
+      </w:r>
+      <w:r>
+        <w:rPr>
+          <w:b/>
+          <w:i w:val="0"/>
+          <w:sz w:val="22"/>
+        </w:rPr>
+        <w:t>20%</w:t>
+      </w:r>
+      <w:r>
+        <w:rPr>
+          <w:b w:val="0"/>
+          <w:i w:val="0"/>
+          <w:sz w:val="22"/>
+        </w:rPr>
+        <w:t>.</w:t>
+      </w:r>
+    </w:p>
+    <w:p>
+      <w:pPr>
+        <w:tabs>
+          <w:tab w:pos="475" w:val="left"/>
+        </w:tabs>
+        <w:spacing w:after="20"/>
+        <w:ind w:left="475" w:hanging="331"/>
+        <w:jc w:val="both"/>
+      </w:pPr>
+      <w:r>
+        <w:rPr>
+          <w:sz w:val="22"/>
+        </w:rPr>
+        <w:t>•</w:t>
+        <w:tab/>
+      </w:r>
+      <w:r>
+        <w:rPr>
+          <w:b w:val="0"/>
+          <w:i w:val="0"/>
+          <w:sz w:val="22"/>
+        </w:rPr>
+        <w:t xml:space="preserve">Containerized and orchestrated Python services using </w:t>
+      </w:r>
+      <w:r>
+        <w:rPr>
+          <w:b/>
+          <w:i w:val="0"/>
+          <w:sz w:val="22"/>
+        </w:rPr>
+        <w:t>Docker</w:t>
+      </w:r>
+      <w:r>
+        <w:rPr>
+          <w:b w:val="0"/>
+          <w:i w:val="0"/>
+          <w:sz w:val="22"/>
+        </w:rPr>
+        <w:t xml:space="preserve"> and </w:t>
+      </w:r>
+      <w:r>
+        <w:rPr>
+          <w:b/>
+          <w:i w:val="0"/>
+          <w:sz w:val="22"/>
+        </w:rPr>
+        <w:t>Kubernetes</w:t>
+      </w:r>
+      <w:r>
+        <w:rPr>
+          <w:b w:val="0"/>
+          <w:i w:val="0"/>
+          <w:sz w:val="22"/>
+        </w:rPr>
+        <w:t xml:space="preserve"> with </w:t>
+      </w:r>
+      <w:r>
+        <w:rPr>
+          <w:b/>
+          <w:i w:val="0"/>
+          <w:sz w:val="22"/>
+        </w:rPr>
+        <w:t>Jenkins CI/CD</w:t>
       </w:r>
       <w:r>
         <w:rPr>
@@ -1927,7 +2161,7 @@
           <w:i w:val="0"/>
           <w:sz w:val="22"/>
         </w:rPr>
-        <w:t xml:space="preserve">Developed real-time monitoring pipelines and </w:t>
+        <w:t xml:space="preserve">Developed high-throughput </w:t>
       </w:r>
       <w:r>
         <w:rPr>
@@ -1935,7 +2169,7 @@
           <w:i w:val="0"/>
           <w:sz w:val="22"/>
         </w:rPr>
-        <w:t>interactive Power BI dashboards</w:t>
+        <w:t>Python/Java</w:t>
       </w:r>
       <w:r>
         <w:rPr>
@@ -1943,7 +2177,7 @@
           <w:i w:val="0"/>
           <w:sz w:val="22"/>
         </w:rPr>
-        <w:t xml:space="preserve"> on </w:t>
+        <w:t xml:space="preserve"> services, including </w:t>
       </w:r>
       <w:r>
         <w:rPr>
@@ -1951,7 +2185,7 @@
           <w:i w:val="0"/>
           <w:sz w:val="22"/>
         </w:rPr>
-        <w:t>Azure Stream Analytics</w:t>
+        <w:t>BERT/BioBERT</w:t>
       </w:r>
       <w:r>
         <w:rPr>
@@ -1959,7 +2193,7 @@
           <w:i w:val="0"/>
           <w:sz w:val="22"/>
         </w:rPr>
-        <w:t xml:space="preserve">, surfacing </w:t>
+        <w:t xml:space="preserve"> clinical entity extraction (</w:t>
       </w:r>
       <w:r>
         <w:rPr>
@@ -1967,7 +2201,7 @@
           <w:i w:val="0"/>
           <w:sz w:val="22"/>
         </w:rPr>
-        <w:t>performance metrics and statistics</w:t>
+        <w:t>80% accuracy</w:t>
       </w:r>
       <w:r>
         <w:rPr>
@@ -1975,7 +2209,7 @@
           <w:i w:val="0"/>
           <w:sz w:val="22"/>
         </w:rPr>
-        <w:t xml:space="preserve"> that reduced unplanned downtime by </w:t>
+        <w:t xml:space="preserve">, </w:t>
       </w:r>
       <w:r>
         <w:rPr>
@@ -1983,7 +2217,7 @@
           <w:i w:val="0"/>
           <w:sz w:val="22"/>
         </w:rPr>
-        <w:t>20%</w:t>
+        <w:t>55%</w:t>
       </w:r>
       <w:r>
         <w:rPr>
@@ -1991,7 +2225,23 @@
           <w:i w:val="0"/>
           <w:sz w:val="22"/>
         </w:rPr>
-        <w:t>.</w:t>
+        <w:t xml:space="preserve"> faster processing) and fault-tolerant </w:t>
+      </w:r>
+      <w:r>
+        <w:rPr>
+          <w:b/>
+          <w:i w:val="0"/>
+          <w:sz w:val="22"/>
+        </w:rPr>
+        <w:t>MongoDB</w:t>
+      </w:r>
+      <w:r>
+        <w:rPr>
+          <w:b w:val="0"/>
+          <w:i w:val="0"/>
+          <w:sz w:val="22"/>
+        </w:rPr>
+        <w:t xml:space="preserve"> data models for unstructured data.</w:t>
       </w:r>
     </w:p>
     <w:p>
@@ -2016,7 +2266,7 @@
           <w:i w:val="0"/>
           <w:sz w:val="22"/>
         </w:rPr>
-        <w:t xml:space="preserve">Delivered Python NLP services using </w:t>
+        <w:t xml:space="preserve">Collaborated with engineering, product, and </w:t>
       </w:r>
       <w:r>
         <w:rPr>
@@ -2024,7 +2274,23 @@
           <w:i w:val="0"/>
           <w:sz w:val="22"/>
         </w:rPr>
-        <w:t>BERT</w:t>
+        <w:t>Accenture</w:t>
+      </w:r>
+      <w:r>
+        <w:rPr>
+          <w:b w:val="0"/>
+          <w:i w:val="0"/>
+          <w:sz w:val="22"/>
+        </w:rPr>
+        <w:t xml:space="preserve"> client teams in </w:t>
+      </w:r>
+      <w:r>
+        <w:rPr>
+          <w:b/>
+          <w:i w:val="0"/>
+          <w:sz w:val="22"/>
+        </w:rPr>
+        <w:t>technical design discussions</w:t>
       </w:r>
       <w:r>
         <w:rPr>
@@ -2040,7 +2306,7 @@
           <w:i w:val="0"/>
           <w:sz w:val="22"/>
         </w:rPr>
-        <w:t>BioBERT</w:t>
+        <w:t>code reviews</w:t>
       </w:r>
       <w:r>
         <w:rPr>
@@ -2048,7 +2314,7 @@
           <w:i w:val="0"/>
           <w:sz w:val="22"/>
         </w:rPr>
-        <w:t xml:space="preserve"> for clinical entity extraction, achieving </w:t>
+        <w:t xml:space="preserve">, and contributed </w:t>
       </w:r>
       <w:r>
         <w:rPr>
@@ -2056,7 +2322,7 @@
           <w:i w:val="0"/>
           <w:sz w:val="22"/>
         </w:rPr>
-        <w:t>80% accuracy</w:t>
+        <w:t>technical documentation</w:t>
       </w:r>
       <w:r>
         <w:rPr>
@@ -2064,153 +2330,7 @@
           <w:i w:val="0"/>
           <w:sz w:val="22"/>
         </w:rPr>
-        <w:t xml:space="preserve"> and reducing document processing time by </w:t>
-      </w:r>
-      <w:r>
-        <w:rPr>
-          <w:b/>
-          <w:i w:val="0"/>
-          <w:sz w:val="22"/>
-        </w:rPr>
-        <w:t>55%</w:t>
-      </w:r>
-      <w:r>
-        <w:rPr>
-          <w:b w:val="0"/>
-          <w:i w:val="0"/>
-          <w:sz w:val="22"/>
-        </w:rPr>
-        <w:t>.</w:t>
-      </w:r>
-    </w:p>
-    <w:p>
-      <w:pPr>
-        <w:tabs>
-          <w:tab w:pos="475" w:val="left"/>
-        </w:tabs>
-        <w:spacing w:after="20"/>
-        <w:ind w:left="475" w:hanging="331"/>
-        <w:jc w:val="both"/>
-      </w:pPr>
-      <w:r>
-        <w:rPr>
-          <w:sz w:val="22"/>
-        </w:rPr>
-        <w:t>•</w:t>
-        <w:tab/>
-      </w:r>
-      <w:r>
-        <w:rPr>
-          <w:b w:val="0"/>
-          <w:i w:val="0"/>
-          <w:sz w:val="22"/>
-        </w:rPr>
-        <w:t xml:space="preserve">Designed </w:t>
-      </w:r>
-      <w:r>
-        <w:rPr>
-          <w:b/>
-          <w:i w:val="0"/>
-          <w:sz w:val="22"/>
-        </w:rPr>
-        <w:t>MongoDB</w:t>
-      </w:r>
-      <w:r>
-        <w:rPr>
-          <w:b w:val="0"/>
-          <w:i w:val="0"/>
-          <w:sz w:val="22"/>
-        </w:rPr>
-        <w:t xml:space="preserve"> data models and </w:t>
-      </w:r>
-      <w:r>
-        <w:rPr>
-          <w:b/>
-          <w:i w:val="0"/>
-          <w:sz w:val="22"/>
-        </w:rPr>
-        <w:t>Python/Java</w:t>
-      </w:r>
-      <w:r>
-        <w:rPr>
-          <w:b w:val="0"/>
-          <w:i w:val="0"/>
-          <w:sz w:val="22"/>
-        </w:rPr>
-        <w:t xml:space="preserve"> validation scripts (UDFs) for high-throughput, fault-tolerant pipelines, improving data quality and consistency.</w:t>
-      </w:r>
-    </w:p>
-    <w:p>
-      <w:pPr>
-        <w:tabs>
-          <w:tab w:pos="475" w:val="left"/>
-        </w:tabs>
-        <w:spacing w:after="20"/>
-        <w:ind w:left="475" w:hanging="331"/>
-        <w:jc w:val="both"/>
-      </w:pPr>
-      <w:r>
-        <w:rPr>
-          <w:sz w:val="22"/>
-        </w:rPr>
-        <w:t>•</w:t>
-        <w:tab/>
-      </w:r>
-      <w:r>
-        <w:rPr>
-          <w:b w:val="0"/>
-          <w:i w:val="0"/>
-          <w:sz w:val="22"/>
-        </w:rPr>
-        <w:t xml:space="preserve">Collaborated with Data Engineering, Product, and </w:t>
-      </w:r>
-      <w:r>
-        <w:rPr>
-          <w:b/>
-          <w:i w:val="0"/>
-          <w:sz w:val="22"/>
-        </w:rPr>
-        <w:t>Accenture</w:t>
-      </w:r>
-      <w:r>
-        <w:rPr>
-          <w:b w:val="0"/>
-          <w:i w:val="0"/>
-          <w:sz w:val="22"/>
-        </w:rPr>
-        <w:t xml:space="preserve"> client stakeholders in </w:t>
-      </w:r>
-      <w:r>
-        <w:rPr>
-          <w:b/>
-          <w:i w:val="0"/>
-          <w:sz w:val="22"/>
-        </w:rPr>
-        <w:t>technical design discussions and code reviews</w:t>
-      </w:r>
-      <w:r>
-        <w:rPr>
-          <w:b w:val="0"/>
-          <w:i w:val="0"/>
-          <w:sz w:val="22"/>
-        </w:rPr>
-        <w:t xml:space="preserve"> to define use cases, KPIs, and delivery roadmaps, reducing project turnaround time by </w:t>
-      </w:r>
-      <w:r>
-        <w:rPr>
-          <w:b/>
-          <w:i w:val="0"/>
-          <w:sz w:val="22"/>
-        </w:rPr>
-        <w:t>15%</w:t>
-      </w:r>
-      <w:r>
-        <w:rPr>
-          <w:b w:val="0"/>
-          <w:i w:val="0"/>
-          <w:sz w:val="22"/>
-        </w:rPr>
-        <w:t>.</w:t>
+        <w:t xml:space="preserve"> and engineering best practices.</w:t>
       </w:r>
     </w:p>
     <w:sectPr>

</xml_diff>

<commit_message>
Rewrite resume experience from actual results in original resumes
GMU role merges Apple and GMU research results; Carelon role merges Carelon,
Accenture, and Honeywell data-engineering results. Skills trimmed to tools
evidenced in the original resumes.

Co-Authored-By: Claude Opus 5.5 <noreply@anthropic.com>
Claude-Session: https://claude.ai/code/session_013uu8YLK93nR2ygpNvDWsMr
</commit_message>
<xml_diff>
--- a/resume/Ritesh_Somashekar_Python_UI_Developer.docx
+++ b/resume/Ritesh_Somashekar_Python_UI_Developer.docx
@@ -112,7 +112,7 @@
           <w:i w:val="0"/>
           <w:sz w:val="22"/>
         </w:rPr>
-        <w:t xml:space="preserve"> of experience enhancing and modernizing enterprise platforms, building </w:t>
+        <w:t xml:space="preserve"> of experience enhancing and modernizing data platforms, building </w:t>
       </w:r>
       <w:r>
         <w:rPr>
@@ -120,7 +120,7 @@
           <w:i w:val="0"/>
           <w:sz w:val="22"/>
         </w:rPr>
-        <w:t>modern, scalable web user interfaces</w:t>
+        <w:t>web dashboards and APIs</w:t>
       </w:r>
       <w:r>
         <w:rPr>
@@ -168,7 +168,7 @@
           <w:i w:val="0"/>
           <w:sz w:val="22"/>
         </w:rPr>
-        <w:t>Python, Java, React, and FastAPI</w:t>
+        <w:t>Python, Java, SQL, FastAPI, and Apache Spark</w:t>
       </w:r>
       <w:r>
         <w:rPr>
@@ -176,7 +176,7 @@
           <w:i w:val="0"/>
           <w:sz w:val="22"/>
         </w:rPr>
-        <w:t xml:space="preserve">. Proven expertise in </w:t>
+        <w:t xml:space="preserve">. Proven experience in </w:t>
       </w:r>
       <w:r>
         <w:rPr>
@@ -184,7 +184,7 @@
           <w:i w:val="0"/>
           <w:sz w:val="22"/>
         </w:rPr>
-        <w:t>access control and authorization (OAuth 2.0, RBAC)</w:t>
+        <w:t>access control and authorization (OAuth 2.0)</w:t>
       </w:r>
       <w:r>
         <w:rPr>
@@ -200,7 +200,7 @@
           <w:i w:val="0"/>
           <w:sz w:val="22"/>
         </w:rPr>
-        <w:t>job queuing and scheduling</w:t>
+        <w:t>job scheduling</w:t>
       </w:r>
       <w:r>
         <w:rPr>
@@ -216,7 +216,7 @@
           <w:i w:val="0"/>
           <w:sz w:val="22"/>
         </w:rPr>
-        <w:t>workflow orchestration (Apache Airflow)</w:t>
+        <w:t>workflow orchestration (Apache Airflow, 20+ production pipelines)</w:t>
       </w:r>
       <w:r>
         <w:rPr>
@@ -265,7 +265,7 @@
           <w:i w:val="0"/>
           <w:sz w:val="22"/>
         </w:rPr>
-        <w:t xml:space="preserve"> with </w:t>
+        <w:t xml:space="preserve"> — cutting iteration cycles from </w:t>
       </w:r>
       <w:r>
         <w:rPr>
@@ -273,7 +273,7 @@
           <w:i w:val="0"/>
           <w:sz w:val="22"/>
         </w:rPr>
-        <w:t>Apache Spark and PySpark</w:t>
+        <w:t>3 days to under 18 hours</w:t>
       </w:r>
       <w:r>
         <w:rPr>
@@ -281,7 +281,7 @@
           <w:i w:val="0"/>
           <w:sz w:val="22"/>
         </w:rPr>
-        <w:t xml:space="preserve">, defining </w:t>
+        <w:t xml:space="preserve">, preprocessing overhead by </w:t>
       </w:r>
       <w:r>
         <w:rPr>
@@ -289,7 +289,7 @@
           <w:i w:val="0"/>
           <w:sz w:val="22"/>
         </w:rPr>
-        <w:t>performance metrics and statistics</w:t>
+        <w:t>70%</w:t>
       </w:r>
       <w:r>
         <w:rPr>
@@ -297,7 +297,7 @@
           <w:i w:val="0"/>
           <w:sz w:val="22"/>
         </w:rPr>
-        <w:t xml:space="preserve">, and refactoring orchestration logic to improve </w:t>
+        <w:t xml:space="preserve">, and release cycles from </w:t>
       </w:r>
       <w:r>
         <w:rPr>
@@ -305,7 +305,7 @@
           <w:i w:val="0"/>
           <w:sz w:val="22"/>
         </w:rPr>
-        <w:t>execution efficiency and throughput</w:t>
+        <w:t>2 weeks to 5 days</w:t>
       </w:r>
       <w:r>
         <w:rPr>
@@ -313,7 +313,7 @@
           <w:i w:val="0"/>
           <w:sz w:val="22"/>
         </w:rPr>
-        <w:t xml:space="preserve">. Experienced in </w:t>
+        <w:t xml:space="preserve">. Experienced with </w:t>
       </w:r>
       <w:r>
         <w:rPr>
@@ -321,7 +321,7 @@
           <w:i w:val="0"/>
           <w:sz w:val="22"/>
         </w:rPr>
-        <w:t>Docker, Kubernetes, and CI/CD pipelines</w:t>
+        <w:t>Docker, Kubernetes, and CI/CD</w:t>
       </w:r>
       <w:r>
         <w:rPr>
@@ -361,7 +361,7 @@
           <w:i w:val="0"/>
           <w:sz w:val="22"/>
         </w:rPr>
-        <w:t xml:space="preserve">, delivering secure, </w:t>
+        <w:t xml:space="preserve">, delivering </w:t>
       </w:r>
       <w:r>
         <w:rPr>
@@ -369,7 +369,7 @@
           <w:i w:val="0"/>
           <w:sz w:val="22"/>
         </w:rPr>
-        <w:t>HIPAA-compliant</w:t>
+        <w:t>HIPAA</w:t>
       </w:r>
       <w:r>
         <w:rPr>
@@ -377,7 +377,23 @@
           <w:i w:val="0"/>
           <w:sz w:val="22"/>
         </w:rPr>
-        <w:t xml:space="preserve"> systems.</w:t>
+        <w:t xml:space="preserve">- and </w:t>
+      </w:r>
+      <w:r>
+        <w:rPr>
+          <w:b/>
+          <w:i w:val="0"/>
+          <w:sz w:val="22"/>
+        </w:rPr>
+        <w:t>PCI-DSS</w:t>
+      </w:r>
+      <w:r>
+        <w:rPr>
+          <w:b w:val="0"/>
+          <w:i w:val="0"/>
+          <w:sz w:val="22"/>
+        </w:rPr>
+        <w:t>-compliant systems.</w:t>
       </w:r>
     </w:p>
     <w:p>
@@ -402,7 +418,7 @@
           <w:i w:val="0"/>
           <w:sz w:val="22"/>
         </w:rPr>
-        <w:t xml:space="preserve">Demonstrated success in </w:t>
+        <w:t xml:space="preserve">Demonstrated success designing </w:t>
       </w:r>
       <w:r>
         <w:rPr>
@@ -410,7 +426,7 @@
           <w:i w:val="0"/>
           <w:sz w:val="22"/>
         </w:rPr>
-        <w:t>redesigning UI architecture</w:t>
+        <w:t>user-facing dashboards and interfaces</w:t>
       </w:r>
       <w:r>
         <w:rPr>
@@ -418,7 +434,7 @@
           <w:i w:val="0"/>
           <w:sz w:val="22"/>
         </w:rPr>
-        <w:t xml:space="preserve"> to improve </w:t>
+        <w:t xml:space="preserve"> (FastAPI, Tableau, Power BI) with clear </w:t>
       </w:r>
       <w:r>
         <w:rPr>
@@ -426,7 +442,7 @@
           <w:i w:val="0"/>
           <w:sz w:val="22"/>
         </w:rPr>
-        <w:t>information hierarchy, usability, consistency, and layout</w:t>
+        <w:t>information hierarchy, usability, and consistent layout</w:t>
       </w:r>
       <w:r>
         <w:rPr>
@@ -434,7 +450,7 @@
           <w:i w:val="0"/>
           <w:sz w:val="22"/>
         </w:rPr>
-        <w:t xml:space="preserve"> across functional modules. Adept at </w:t>
+        <w:t xml:space="preserve">. Adept at </w:t>
       </w:r>
       <w:r>
         <w:rPr>
@@ -450,7 +466,7 @@
           <w:i w:val="0"/>
           <w:sz w:val="22"/>
         </w:rPr>
-        <w:t>, collaborating effectively across engineering, product, and research teams.</w:t>
+        <w:t>, collaborating effectively across engineering, product, research, and client teams.</w:t>
       </w:r>
     </w:p>
     <w:p>
@@ -488,7 +504,7 @@
           <w:i w:val="0"/>
           <w:sz w:val="22"/>
         </w:rPr>
-        <w:t xml:space="preserve"> Python (pandas, NumPy, asyncio), Java, JavaScript, TypeScript, SQL (PostgreSQL, Oracle), Bash</w:t>
+        <w:t xml:space="preserve"> Python (pandas, NumPy, scikit-learn, PyTorch), Java, SQL (PostgreSQL, Oracle), R, Scala</w:t>
       </w:r>
     </w:p>
     <w:p>
@@ -503,7 +519,7 @@
           <w:i w:val="0"/>
           <w:sz w:val="22"/>
         </w:rPr>
-        <w:t>Web UI &amp; Frontend:</w:t>
+        <w:t>Web UI, APIs &amp; Security:</w:t>
       </w:r>
       <w:r>
         <w:rPr>
@@ -511,7 +527,7 @@
           <w:i w:val="0"/>
           <w:sz w:val="22"/>
         </w:rPr>
-        <w:t xml:space="preserve"> React, HTML5, CSS3, Responsive Design, Component Libraries, Design Systems, Figma, Accessibility (WCAG), Data Visualization (Plotly, Power BI, Tableau)</w:t>
+        <w:t xml:space="preserve"> FastAPI, RESTful Microservices, API Versioning, OAuth 2.0, Dashboard Design, Tableau, Power BI, Data Visualization</w:t>
       </w:r>
     </w:p>
     <w:p>
@@ -526,7 +542,7 @@
           <w:i w:val="0"/>
           <w:sz w:val="22"/>
         </w:rPr>
-        <w:t>Backend, APIs &amp; Security:</w:t>
+        <w:t>Job Scheduling &amp; Orchestration:</w:t>
       </w:r>
       <w:r>
         <w:rPr>
@@ -534,7 +550,7 @@
           <w:i w:val="0"/>
           <w:sz w:val="22"/>
         </w:rPr>
-        <w:t xml:space="preserve"> FastAPI, Flask, RESTful Microservices, API Versioning, OAuth 2.0, JWT, Role-Based Access Control (RBAC), Authentication &amp; Authorization</w:t>
+        <w:t xml:space="preserve"> Apache Airflow (DAGs), HPC Job Scheduling (ORC Hopper), Kafka, AWS SQS, Event-Driven Workflows, CI/CD</w:t>
       </w:r>
     </w:p>
     <w:p>
@@ -549,7 +565,7 @@
           <w:i w:val="0"/>
           <w:sz w:val="22"/>
         </w:rPr>
-        <w:t>Job Scheduling &amp; Orchestration:</w:t>
+        <w:t>Containerization &amp; DevOps:</w:t>
       </w:r>
       <w:r>
         <w:rPr>
@@ -557,7 +573,7 @@
           <w:i w:val="0"/>
           <w:sz w:val="22"/>
         </w:rPr>
-        <w:t xml:space="preserve"> Apache Airflow (DAGs), Celery, Job Queuing &amp; Prioritization, Concurrent Execution, Kafka, Redis, Event-Driven Workflows</w:t>
+        <w:t xml:space="preserve"> Docker, Kubernetes, Jenkins, Git, DVC, MLflow</w:t>
       </w:r>
     </w:p>
     <w:p>
@@ -572,7 +588,7 @@
           <w:i w:val="0"/>
           <w:sz w:val="22"/>
         </w:rPr>
-        <w:t>Containerization &amp; DevOps:</w:t>
+        <w:t>Distributed Processing &amp; Performance:</w:t>
       </w:r>
       <w:r>
         <w:rPr>
@@ -580,7 +596,7 @@
           <w:i w:val="0"/>
           <w:sz w:val="22"/>
         </w:rPr>
-        <w:t xml:space="preserve"> Docker, Kubernetes, Jenkins, CI/CD, Git, DVC, MLflow</w:t>
+        <w:t xml:space="preserve"> Apache Spark, PySpark, AWS EMR, Hadoop, Hive, Sqoop, ETL Pipelines, Delta Lake, Performance Tuning, Optuna</w:t>
       </w:r>
     </w:p>
     <w:p>
@@ -595,7 +611,7 @@
           <w:i w:val="0"/>
           <w:sz w:val="22"/>
         </w:rPr>
-        <w:t>Distributed Processing &amp; Performance:</w:t>
+        <w:t>Cloud &amp; Databases:</w:t>
       </w:r>
       <w:r>
         <w:rPr>
@@ -603,7 +619,7 @@
           <w:i w:val="0"/>
           <w:sz w:val="22"/>
         </w:rPr>
-        <w:t xml:space="preserve"> Apache Spark, PySpark, Hadoop, Hive, ETL Pipelines, Profiling (cProfile), Performance Metrics, Throughput Optimization</w:t>
+        <w:t xml:space="preserve"> AWS (S3, EC2, Lambda, Glue, RDS, Athena, SageMaker), Azure (Stream Analytics, Data Services), MongoDB, Snowflake, Databricks</w:t>
       </w:r>
     </w:p>
     <w:p>
@@ -618,7 +634,7 @@
           <w:i w:val="0"/>
           <w:sz w:val="22"/>
         </w:rPr>
-        <w:t>Cloud &amp; Databases:</w:t>
+        <w:t>ML &amp; NLP:</w:t>
       </w:r>
       <w:r>
         <w:rPr>
@@ -626,30 +642,7 @@
           <w:i w:val="0"/>
           <w:sz w:val="22"/>
         </w:rPr>
-        <w:t xml:space="preserve"> AWS (S3, EC2, Lambda, Glue, RDS, SageMaker), Azure (Stream Analytics, Data Services), MongoDB, Snowflake, Delta Lake</w:t>
-      </w:r>
-    </w:p>
-    <w:p>
-      <w:pPr>
-        <w:spacing w:after="60"/>
-        <w:ind w:left="144"/>
-        <w:jc w:val="both"/>
-      </w:pPr>
-      <w:r>
-        <w:rPr>
-          <w:b/>
-          <w:i w:val="0"/>
-          <w:sz w:val="22"/>
-        </w:rPr>
-        <w:t>ML &amp; Analytics:</w:t>
-      </w:r>
-      <w:r>
-        <w:rPr>
-          <w:b w:val="0"/>
-          <w:i w:val="0"/>
-          <w:sz w:val="22"/>
-        </w:rPr>
-        <w:t xml:space="preserve"> PyTorch, scikit-learn, HuggingFace Transformers, BERT/BioBERT, Optuna</w:t>
+        <w:t xml:space="preserve"> PyTorch, Core ML, TensorFlow, XGBoost, LightGBM, HuggingFace Transformers, BERT/BioBERT, Llama 3, SHAP</w:t>
       </w:r>
     </w:p>
     <w:p>
@@ -783,7 +776,7 @@
           <w:i w:val="0"/>
           <w:sz w:val="22"/>
         </w:rPr>
-        <w:t xml:space="preserve">Modernized the </w:t>
+        <w:t xml:space="preserve">Designed and implemented a </w:t>
       </w:r>
       <w:r>
         <w:rPr>
@@ -791,7 +784,7 @@
           <w:i w:val="0"/>
           <w:sz w:val="22"/>
         </w:rPr>
-        <w:t>UI architecture</w:t>
+        <w:t>multi-user research dashboard</w:t>
       </w:r>
       <w:r>
         <w:rPr>
@@ -799,7 +792,7 @@
           <w:i w:val="0"/>
           <w:sz w:val="22"/>
         </w:rPr>
-        <w:t xml:space="preserve"> of a multi-user research analytics platform through a full redesign in </w:t>
+        <w:t xml:space="preserve"> backed by a </w:t>
       </w:r>
       <w:r>
         <w:rPr>
@@ -807,7 +800,7 @@
           <w:i w:val="0"/>
           <w:sz w:val="22"/>
         </w:rPr>
-        <w:t>React</w:t>
+        <w:t>FastAPI</w:t>
       </w:r>
       <w:r>
         <w:rPr>
@@ -823,7 +816,7 @@
           <w:i w:val="0"/>
           <w:sz w:val="22"/>
         </w:rPr>
-        <w:t>Python (FastAPI)</w:t>
+        <w:t>Docker</w:t>
       </w:r>
       <w:r>
         <w:rPr>
@@ -831,7 +824,7 @@
           <w:i w:val="0"/>
           <w:sz w:val="22"/>
         </w:rPr>
-        <w:t xml:space="preserve">, improving </w:t>
+        <w:t xml:space="preserve"> service, structuring </w:t>
       </w:r>
       <w:r>
         <w:rPr>
@@ -839,7 +832,7 @@
           <w:i w:val="0"/>
           <w:sz w:val="22"/>
         </w:rPr>
-        <w:t>information hierarchy, usability, consistency, and layout</w:t>
+        <w:t>information hierarchy and layout</w:t>
       </w:r>
       <w:r>
         <w:rPr>
@@ -847,7 +840,23 @@
           <w:i w:val="0"/>
           <w:sz w:val="22"/>
         </w:rPr>
-        <w:t xml:space="preserve"> across functional modules (data ingestion, job monitoring, results, and administration).</w:t>
+        <w:t xml:space="preserve"> across analysis views and serving results to users with </w:t>
+      </w:r>
+      <w:r>
+        <w:rPr>
+          <w:b/>
+          <w:i w:val="0"/>
+          <w:sz w:val="22"/>
+        </w:rPr>
+        <w:t>sub-200ms latency</w:t>
+      </w:r>
+      <w:r>
+        <w:rPr>
+          <w:b w:val="0"/>
+          <w:i w:val="0"/>
+          <w:sz w:val="22"/>
+        </w:rPr>
+        <w:t>.</w:t>
       </w:r>
     </w:p>
     <w:p>
@@ -872,7 +881,7 @@
           <w:i w:val="0"/>
           <w:sz w:val="22"/>
         </w:rPr>
-        <w:t xml:space="preserve">Designed and developed </w:t>
+        <w:t xml:space="preserve">Built </w:t>
       </w:r>
       <w:r>
         <w:rPr>
@@ -880,7 +889,7 @@
           <w:i w:val="0"/>
           <w:sz w:val="22"/>
         </w:rPr>
-        <w:t>modern, scalable web user interfaces</w:t>
+        <w:t>Tableau</w:t>
       </w:r>
       <w:r>
         <w:rPr>
@@ -888,7 +897,7 @@
           <w:i w:val="0"/>
           <w:sz w:val="22"/>
         </w:rPr>
-        <w:t xml:space="preserve"> backed by a reusable </w:t>
+        <w:t xml:space="preserve"> visualizations and reports for disaster-response and social-cohesion research, improving </w:t>
       </w:r>
       <w:r>
         <w:rPr>
@@ -896,7 +905,7 @@
           <w:i w:val="0"/>
           <w:sz w:val="22"/>
         </w:rPr>
-        <w:t>component library and design system</w:t>
+        <w:t>usability and consistency</w:t>
       </w:r>
       <w:r>
         <w:rPr>
@@ -904,55 +913,7 @@
           <w:i w:val="0"/>
           <w:sz w:val="22"/>
         </w:rPr>
-        <w:t xml:space="preserve">, applying </w:t>
-      </w:r>
-      <w:r>
-        <w:rPr>
-          <w:b/>
-          <w:i w:val="0"/>
-          <w:sz w:val="22"/>
-        </w:rPr>
-        <w:t>responsive design</w:t>
-      </w:r>
-      <w:r>
-        <w:rPr>
-          <w:b w:val="0"/>
-          <w:i w:val="0"/>
-          <w:sz w:val="22"/>
-        </w:rPr>
-        <w:t xml:space="preserve"> and </w:t>
-      </w:r>
-      <w:r>
-        <w:rPr>
-          <w:b/>
-          <w:i w:val="0"/>
-          <w:sz w:val="22"/>
-        </w:rPr>
-        <w:t>accessibility (WCAG)</w:t>
-      </w:r>
-      <w:r>
-        <w:rPr>
-          <w:b w:val="0"/>
-          <w:i w:val="0"/>
-          <w:sz w:val="22"/>
-        </w:rPr>
-        <w:t xml:space="preserve"> standards and serving data to the UI with </w:t>
-      </w:r>
-      <w:r>
-        <w:rPr>
-          <w:b/>
-          <w:i w:val="0"/>
-          <w:sz w:val="22"/>
-        </w:rPr>
-        <w:t>sub-200ms latency</w:t>
-      </w:r>
-      <w:r>
-        <w:rPr>
-          <w:b w:val="0"/>
-          <w:i w:val="0"/>
-          <w:sz w:val="22"/>
-        </w:rPr>
-        <w:t>.</w:t>
+        <w:t xml:space="preserve"> of how findings were presented to research stakeholders.</w:t>
       </w:r>
     </w:p>
     <w:p>
@@ -977,7 +938,7 @@
           <w:i w:val="0"/>
           <w:sz w:val="22"/>
         </w:rPr>
-        <w:t xml:space="preserve">Enhanced </w:t>
+        <w:t xml:space="preserve">Scheduled and ran </w:t>
       </w:r>
       <w:r>
         <w:rPr>
@@ -985,7 +946,7 @@
           <w:i w:val="0"/>
           <w:sz w:val="22"/>
         </w:rPr>
-        <w:t>access control and authorization</w:t>
+        <w:t>long-running compute jobs</w:t>
       </w:r>
       <w:r>
         <w:rPr>
@@ -993,7 +954,7 @@
           <w:i w:val="0"/>
           <w:sz w:val="22"/>
         </w:rPr>
-        <w:t xml:space="preserve"> by implementing </w:t>
+        <w:t xml:space="preserve"> (graph analytics and ensemble forecasting) on the </w:t>
       </w:r>
       <w:r>
         <w:rPr>
@@ -1001,7 +962,7 @@
           <w:i w:val="0"/>
           <w:sz w:val="22"/>
         </w:rPr>
-        <w:t>role-based access control (RBAC)</w:t>
+        <w:t>ORC Hopper HPC cluster</w:t>
       </w:r>
       <w:r>
         <w:rPr>
@@ -1009,7 +970,7 @@
           <w:i w:val="0"/>
           <w:sz w:val="22"/>
         </w:rPr>
-        <w:t xml:space="preserve"> and token-based (</w:t>
+        <w:t xml:space="preserve"> using </w:t>
       </w:r>
       <w:r>
         <w:rPr>
@@ -1017,7 +978,7 @@
           <w:i w:val="0"/>
           <w:sz w:val="22"/>
         </w:rPr>
-        <w:t>JWT</w:t>
+        <w:t>Python</w:t>
       </w:r>
       <w:r>
         <w:rPr>
@@ -1025,7 +986,39 @@
           <w:i w:val="0"/>
           <w:sz w:val="22"/>
         </w:rPr>
-        <w:t>) authentication on FastAPI endpoints, enforcing role- and project-level permissions for datasets, jobs, and results.</w:t>
+        <w:t xml:space="preserve"> and </w:t>
+      </w:r>
+      <w:r>
+        <w:rPr>
+          <w:b/>
+          <w:i w:val="0"/>
+          <w:sz w:val="22"/>
+        </w:rPr>
+        <w:t>R</w:t>
+      </w:r>
+      <w:r>
+        <w:rPr>
+          <w:b w:val="0"/>
+          <w:i w:val="0"/>
+          <w:sz w:val="22"/>
+        </w:rPr>
+        <w:t xml:space="preserve">, achieving an </w:t>
+      </w:r>
+      <w:r>
+        <w:rPr>
+          <w:b/>
+          <w:i w:val="0"/>
+          <w:sz w:val="22"/>
+        </w:rPr>
+        <w:t>RMSE of 0.89</w:t>
+      </w:r>
+      <w:r>
+        <w:rPr>
+          <w:b w:val="0"/>
+          <w:i w:val="0"/>
+          <w:sz w:val="22"/>
+        </w:rPr>
+        <w:t xml:space="preserve"> on large-scale real-world datasets.</w:t>
       </w:r>
     </w:p>
     <w:p>
@@ -1050,7 +1043,7 @@
           <w:i w:val="0"/>
           <w:sz w:val="22"/>
         </w:rPr>
-        <w:t xml:space="preserve">Built </w:t>
+        <w:t xml:space="preserve">Analyzed and optimized </w:t>
       </w:r>
       <w:r>
         <w:rPr>
@@ -1058,7 +1051,7 @@
           <w:i w:val="0"/>
           <w:sz w:val="22"/>
         </w:rPr>
-        <w:t>job queuing and scheduling</w:t>
+        <w:t>end-to-end processing pipelines</w:t>
       </w:r>
       <w:r>
         <w:rPr>
@@ -1066,7 +1059,7 @@
           <w:i w:val="0"/>
           <w:sz w:val="22"/>
         </w:rPr>
-        <w:t xml:space="preserve"> for long-running compute jobs (NLP runs over </w:t>
+        <w:t xml:space="preserve"> in </w:t>
       </w:r>
       <w:r>
         <w:rPr>
@@ -1074,7 +1067,7 @@
           <w:i w:val="0"/>
           <w:sz w:val="22"/>
         </w:rPr>
-        <w:t>30K+ documents</w:t>
+        <w:t>Python, PyTorch, and MLflow</w:t>
       </w:r>
       <w:r>
         <w:rPr>
@@ -1082,7 +1075,7 @@
           <w:i w:val="0"/>
           <w:sz w:val="22"/>
         </w:rPr>
-        <w:t xml:space="preserve">) on the </w:t>
+        <w:t xml:space="preserve">, automating tuning with </w:t>
       </w:r>
       <w:r>
         <w:rPr>
@@ -1090,7 +1083,7 @@
           <w:i w:val="0"/>
           <w:sz w:val="22"/>
         </w:rPr>
-        <w:t>ORC Hopper HPC cluster</w:t>
+        <w:t>Optuna</w:t>
       </w:r>
       <w:r>
         <w:rPr>
@@ -1098,7 +1091,7 @@
           <w:i w:val="0"/>
           <w:sz w:val="22"/>
         </w:rPr>
-        <w:t xml:space="preserve">, supporting </w:t>
+        <w:t xml:space="preserve"> to cut iteration cycles from </w:t>
       </w:r>
       <w:r>
         <w:rPr>
@@ -1106,7 +1099,7 @@
           <w:i w:val="0"/>
           <w:sz w:val="22"/>
         </w:rPr>
-        <w:t>concurrent execution, priority-based dispatching, and efficient resource allocation</w:t>
+        <w:t>3 days to under 18 hours</w:t>
       </w:r>
       <w:r>
         <w:rPr>
@@ -1139,7 +1132,7 @@
           <w:i w:val="0"/>
           <w:sz w:val="22"/>
         </w:rPr>
-        <w:t xml:space="preserve">Streamlined </w:t>
+        <w:t xml:space="preserve">Built a transformer-based </w:t>
       </w:r>
       <w:r>
         <w:rPr>
@@ -1147,7 +1140,7 @@
           <w:i w:val="0"/>
           <w:sz w:val="22"/>
         </w:rPr>
-        <w:t>end-to-end workflows</w:t>
+        <w:t>document-processing pipeline</w:t>
       </w:r>
       <w:r>
         <w:rPr>
@@ -1155,7 +1148,7 @@
           <w:i w:val="0"/>
           <w:sz w:val="22"/>
         </w:rPr>
-        <w:t xml:space="preserve"> by identifying bottlenecks in data-preparation and training stages and </w:t>
+        <w:t xml:space="preserve"> (</w:t>
       </w:r>
       <w:r>
         <w:rPr>
@@ -1163,7 +1156,7 @@
           <w:i w:val="0"/>
           <w:sz w:val="22"/>
         </w:rPr>
-        <w:t>refactoring orchestration logic</w:t>
+        <w:t>BioBERT</w:t>
       </w:r>
       <w:r>
         <w:rPr>
@@ -1171,7 +1164,7 @@
           <w:i w:val="0"/>
           <w:sz w:val="22"/>
         </w:rPr>
-        <w:t xml:space="preserve">, standardizing </w:t>
+        <w:t xml:space="preserve">, HuggingFace) over </w:t>
       </w:r>
       <w:r>
         <w:rPr>
@@ -1179,7 +1172,7 @@
           <w:i w:val="0"/>
           <w:sz w:val="22"/>
         </w:rPr>
-        <w:t>15GB</w:t>
+        <w:t>30K documents</w:t>
       </w:r>
       <w:r>
         <w:rPr>
@@ -1187,7 +1180,7 @@
           <w:i w:val="0"/>
           <w:sz w:val="22"/>
         </w:rPr>
-        <w:t xml:space="preserve"> of data across 6 datasets and reducing preparation time by </w:t>
+        <w:t xml:space="preserve">, improving entity-recognition F1-score by </w:t>
       </w:r>
       <w:r>
         <w:rPr>
@@ -1195,7 +1188,7 @@
           <w:i w:val="0"/>
           <w:sz w:val="22"/>
         </w:rPr>
-        <w:t>30%</w:t>
+        <w:t>18%</w:t>
       </w:r>
       <w:r>
         <w:rPr>
@@ -1203,7 +1196,39 @@
           <w:i w:val="0"/>
           <w:sz w:val="22"/>
         </w:rPr>
-        <w:t>.</w:t>
+        <w:t xml:space="preserve"> and standardizing </w:t>
+      </w:r>
+      <w:r>
+        <w:rPr>
+          <w:b/>
+          <w:i w:val="0"/>
+          <w:sz w:val="22"/>
+        </w:rPr>
+        <w:t>15GB</w:t>
+      </w:r>
+      <w:r>
+        <w:rPr>
+          <w:b w:val="0"/>
+          <w:i w:val="0"/>
+          <w:sz w:val="22"/>
+        </w:rPr>
+        <w:t xml:space="preserve"> across 6 datasets with </w:t>
+      </w:r>
+      <w:r>
+        <w:rPr>
+          <w:b/>
+          <w:i w:val="0"/>
+          <w:sz w:val="22"/>
+        </w:rPr>
+        <w:t>30%</w:t>
+      </w:r>
+      <w:r>
+        <w:rPr>
+          <w:b w:val="0"/>
+          <w:i w:val="0"/>
+          <w:sz w:val="22"/>
+        </w:rPr>
+        <w:t xml:space="preserve"> less preparation time.</w:t>
       </w:r>
     </w:p>
     <w:p>
@@ -1228,7 +1253,7 @@
           <w:i w:val="0"/>
           <w:sz w:val="22"/>
         </w:rPr>
-        <w:t xml:space="preserve">Analyzed </w:t>
+        <w:t xml:space="preserve">Engineered </w:t>
       </w:r>
       <w:r>
         <w:rPr>
@@ -1236,7 +1261,7 @@
           <w:i w:val="0"/>
           <w:sz w:val="22"/>
         </w:rPr>
-        <w:t>run-processing pipelines</w:t>
+        <w:t>distributed feature pipelines</w:t>
       </w:r>
       <w:r>
         <w:rPr>
@@ -1244,7 +1269,7 @@
           <w:i w:val="0"/>
           <w:sz w:val="22"/>
         </w:rPr>
-        <w:t xml:space="preserve">, developed </w:t>
+        <w:t xml:space="preserve"> on </w:t>
       </w:r>
       <w:r>
         <w:rPr>
@@ -1252,7 +1277,7 @@
           <w:i w:val="0"/>
           <w:sz w:val="22"/>
         </w:rPr>
-        <w:t>performance metrics and statistics</w:t>
+        <w:t>Apache Spark</w:t>
       </w:r>
       <w:r>
         <w:rPr>
@@ -1260,7 +1285,7 @@
           <w:i w:val="0"/>
           <w:sz w:val="22"/>
         </w:rPr>
-        <w:t xml:space="preserve"> (runtime, queue wait, throughput) with </w:t>
+        <w:t xml:space="preserve"> and </w:t>
       </w:r>
       <w:r>
         <w:rPr>
@@ -1268,7 +1293,7 @@
           <w:i w:val="0"/>
           <w:sz w:val="22"/>
         </w:rPr>
-        <w:t>MLflow</w:t>
+        <w:t>AWS EMR</w:t>
       </w:r>
       <w:r>
         <w:rPr>
@@ -1276,7 +1301,7 @@
           <w:i w:val="0"/>
           <w:sz w:val="22"/>
         </w:rPr>
-        <w:t xml:space="preserve">, and applied optimization strategies that cut iteration cycles from </w:t>
+        <w:t xml:space="preserve"> for large-scale telemetry data with </w:t>
       </w:r>
       <w:r>
         <w:rPr>
@@ -1284,7 +1309,7 @@
           <w:i w:val="0"/>
           <w:sz w:val="22"/>
         </w:rPr>
-        <w:t>3 days to under 18 hours</w:t>
+        <w:t>privacy-preserving data compliance</w:t>
       </w:r>
       <w:r>
         <w:rPr>
@@ -1292,7 +1317,23 @@
           <w:i w:val="0"/>
           <w:sz w:val="22"/>
         </w:rPr>
-        <w:t>.</w:t>
+        <w:t xml:space="preserve">, and served on-device models at </w:t>
+      </w:r>
+      <w:r>
+        <w:rPr>
+          <w:b/>
+          <w:i w:val="0"/>
+          <w:sz w:val="22"/>
+        </w:rPr>
+        <w:t>sub-150ms latency</w:t>
+      </w:r>
+      <w:r>
+        <w:rPr>
+          <w:b w:val="0"/>
+          <w:i w:val="0"/>
+          <w:sz w:val="22"/>
+        </w:rPr>
+        <w:t xml:space="preserve"> for millions of daily requests.</w:t>
       </w:r>
     </w:p>
     <w:p>
@@ -1317,7 +1358,7 @@
           <w:i w:val="0"/>
           <w:sz w:val="22"/>
         </w:rPr>
-        <w:t xml:space="preserve">Containerized platform services with </w:t>
+        <w:t xml:space="preserve">Streamlined deployment workflows with </w:t>
       </w:r>
       <w:r>
         <w:rPr>
@@ -1325,7 +1366,7 @@
           <w:i w:val="0"/>
           <w:sz w:val="22"/>
         </w:rPr>
-        <w:t>Docker</w:t>
+        <w:t>MLflow</w:t>
       </w:r>
       <w:r>
         <w:rPr>
@@ -1333,7 +1374,7 @@
           <w:i w:val="0"/>
           <w:sz w:val="22"/>
         </w:rPr>
-        <w:t xml:space="preserve"> and automated delivery through </w:t>
+        <w:t xml:space="preserve"> and </w:t>
       </w:r>
       <w:r>
         <w:rPr>
@@ -1341,7 +1382,7 @@
           <w:i w:val="0"/>
           <w:sz w:val="22"/>
         </w:rPr>
-        <w:t>CI/CD pipelines</w:t>
+        <w:t>FastAPI</w:t>
       </w:r>
       <w:r>
         <w:rPr>
@@ -1365,7 +1406,7 @@
           <w:i w:val="0"/>
           <w:sz w:val="22"/>
         </w:rPr>
-        <w:t xml:space="preserve"> and enabling </w:t>
+        <w:t xml:space="preserve">, enabling </w:t>
       </w:r>
       <w:r>
         <w:rPr>
@@ -1381,7 +1422,39 @@
           <w:i w:val="0"/>
           <w:sz w:val="22"/>
         </w:rPr>
-        <w:t xml:space="preserve"> of UI and backend changes.</w:t>
+        <w:t xml:space="preserve">, and shrinking model size by </w:t>
+      </w:r>
+      <w:r>
+        <w:rPr>
+          <w:b/>
+          <w:i w:val="0"/>
+          <w:sz w:val="22"/>
+        </w:rPr>
+        <w:t>40%</w:t>
+      </w:r>
+      <w:r>
+        <w:rPr>
+          <w:b w:val="0"/>
+          <w:i w:val="0"/>
+          <w:sz w:val="22"/>
+        </w:rPr>
+        <w:t xml:space="preserve"> (LoRA, QAT) within </w:t>
+      </w:r>
+      <w:r>
+        <w:rPr>
+          <w:b/>
+          <w:i w:val="0"/>
+          <w:sz w:val="22"/>
+        </w:rPr>
+        <w:t>3%</w:t>
+      </w:r>
+      <w:r>
+        <w:rPr>
+          <w:b w:val="0"/>
+          <w:i w:val="0"/>
+          <w:sz w:val="22"/>
+        </w:rPr>
+        <w:t xml:space="preserve"> of baseline accuracy.</w:t>
       </w:r>
     </w:p>
     <w:p>
@@ -1406,7 +1479,7 @@
           <w:i w:val="0"/>
           <w:sz w:val="22"/>
         </w:rPr>
-        <w:t xml:space="preserve">Collaborated in </w:t>
+        <w:t xml:space="preserve">Built a </w:t>
       </w:r>
       <w:r>
         <w:rPr>
@@ -1414,7 +1487,7 @@
           <w:i w:val="0"/>
           <w:sz w:val="22"/>
         </w:rPr>
-        <w:t>technical design discussions</w:t>
+        <w:t>LightGBM</w:t>
       </w:r>
       <w:r>
         <w:rPr>
@@ -1422,7 +1495,7 @@
           <w:i w:val="0"/>
           <w:sz w:val="22"/>
         </w:rPr>
-        <w:t xml:space="preserve"> and </w:t>
+        <w:t xml:space="preserve"> anomaly-detection service with threshold-based alerting under </w:t>
       </w:r>
       <w:r>
         <w:rPr>
@@ -1430,7 +1503,7 @@
           <w:i w:val="0"/>
           <w:sz w:val="22"/>
         </w:rPr>
-        <w:t>code reviews</w:t>
+        <w:t>PCI-DSS</w:t>
       </w:r>
       <w:r>
         <w:rPr>
@@ -1438,7 +1511,7 @@
           <w:i w:val="0"/>
           <w:sz w:val="22"/>
         </w:rPr>
-        <w:t xml:space="preserve"> (Git, DVC), and authored </w:t>
+        <w:t xml:space="preserve"> compliance, reducing false positives by </w:t>
       </w:r>
       <w:r>
         <w:rPr>
@@ -1446,7 +1519,7 @@
           <w:i w:val="0"/>
           <w:sz w:val="22"/>
         </w:rPr>
-        <w:t>technical documentation</w:t>
+        <w:t>25%</w:t>
       </w:r>
       <w:r>
         <w:rPr>
@@ -1454,7 +1527,7 @@
           <w:i w:val="0"/>
           <w:sz w:val="22"/>
         </w:rPr>
-        <w:t xml:space="preserve"> and </w:t>
+        <w:t xml:space="preserve">, with </w:t>
       </w:r>
       <w:r>
         <w:rPr>
@@ -1462,7 +1535,7 @@
           <w:i w:val="0"/>
           <w:sz w:val="22"/>
         </w:rPr>
-        <w:t>engineering best practices</w:t>
+        <w:t>SHAP</w:t>
       </w:r>
       <w:r>
         <w:rPr>
@@ -1470,58 +1543,7 @@
           <w:i w:val="0"/>
           <w:sz w:val="22"/>
         </w:rPr>
-        <w:t xml:space="preserve">, reducing onboarding time for new contributors to </w:t>
-      </w:r>
-      <w:r>
-        <w:rPr>
-          <w:b/>
-          <w:i w:val="0"/>
-          <w:sz w:val="22"/>
-        </w:rPr>
-        <w:t>under 2 days</w:t>
-      </w:r>
-      <w:r>
-        <w:rPr>
-          <w:b w:val="0"/>
-          <w:i w:val="0"/>
-          <w:sz w:val="22"/>
-        </w:rPr>
-        <w:t>.</w:t>
-      </w:r>
-    </w:p>
-    <w:p>
-      <w:pPr>
-        <w:tabs>
-          <w:tab w:pos="11592" w:val="right"/>
-        </w:tabs>
-        <w:spacing w:before="120" w:after="40"/>
-      </w:pPr>
-      <w:r>
-        <w:rPr>
-          <w:b/>
-          <w:sz w:val="24"/>
-        </w:rPr>
-        <w:t xml:space="preserve">Carelon Global Solutions </w:t>
-      </w:r>
-      <w:r>
-        <w:rPr>
-          <w:b/>
-        </w:rPr>
-        <w:t xml:space="preserve">| </w:t>
-      </w:r>
-      <w:r>
-        <w:rPr>
-          <w:b/>
-          <w:i/>
-        </w:rPr>
-        <w:t>Python Developer (Client: Accenture)</w:t>
-      </w:r>
-      <w:r>
-        <w:rPr>
-          <w:b/>
-        </w:rPr>
-        <w:tab/>
-        <w:t>India | January 2019 – July 2023</w:t>
+        <w:t>-based explainability for governance reviews.</w:t>
       </w:r>
     </w:p>
     <w:p>
@@ -1546,7 +1568,7 @@
           <w:i w:val="0"/>
           <w:sz w:val="22"/>
         </w:rPr>
-        <w:t xml:space="preserve">Designed and extended </w:t>
+        <w:t xml:space="preserve">Collaborated in </w:t>
       </w:r>
       <w:r>
         <w:rPr>
@@ -1554,7 +1576,7 @@
           <w:i w:val="0"/>
           <w:sz w:val="22"/>
         </w:rPr>
-        <w:t>access control and authorization</w:t>
+        <w:t>design discussions and code reviews</w:t>
       </w:r>
       <w:r>
         <w:rPr>
@@ -1562,7 +1584,7 @@
           <w:i w:val="0"/>
           <w:sz w:val="22"/>
         </w:rPr>
-        <w:t xml:space="preserve"> for enterprise </w:t>
+        <w:t xml:space="preserve"> (Git, DVC) and authored </w:t>
       </w:r>
       <w:r>
         <w:rPr>
@@ -1570,7 +1592,7 @@
           <w:i w:val="0"/>
           <w:sz w:val="22"/>
         </w:rPr>
-        <w:t>RESTful microservices</w:t>
+        <w:t>technical documentation</w:t>
       </w:r>
       <w:r>
         <w:rPr>
@@ -1578,7 +1600,7 @@
           <w:i w:val="0"/>
           <w:sz w:val="22"/>
         </w:rPr>
-        <w:t xml:space="preserve"> using </w:t>
+        <w:t xml:space="preserve"> and reproducibility standards, reducing onboarding time for new contributors to </w:t>
       </w:r>
       <w:r>
         <w:rPr>
@@ -1586,7 +1608,7 @@
           <w:i w:val="0"/>
           <w:sz w:val="22"/>
         </w:rPr>
-        <w:t>OAuth 2.0</w:t>
+        <w:t>under 2 days</w:t>
       </w:r>
       <w:r>
         <w:rPr>
@@ -1594,39 +1616,42 @@
           <w:i w:val="0"/>
           <w:sz w:val="22"/>
         </w:rPr>
-        <w:t xml:space="preserve">, role-based permissions, and </w:t>
-      </w:r>
+        <w:t>.</w:t>
+      </w:r>
+    </w:p>
+    <w:p>
+      <w:pPr>
+        <w:tabs>
+          <w:tab w:pos="11592" w:val="right"/>
+        </w:tabs>
+        <w:spacing w:before="120" w:after="40"/>
+      </w:pPr>
       <w:r>
         <w:rPr>
           <w:b/>
-          <w:i w:val="0"/>
-          <w:sz w:val="22"/>
-        </w:rPr>
-        <w:t>API versioning</w:t>
-      </w:r>
-      <w:r>
-        <w:rPr>
-          <w:b w:val="0"/>
-          <w:i w:val="0"/>
-          <w:sz w:val="22"/>
-        </w:rPr>
-        <w:t xml:space="preserve">, securing </w:t>
+          <w:sz w:val="24"/>
+        </w:rPr>
+        <w:t xml:space="preserve">Carelon Global Solutions </w:t>
       </w:r>
       <w:r>
         <w:rPr>
           <w:b/>
-          <w:i w:val="0"/>
-          <w:sz w:val="22"/>
-        </w:rPr>
-        <w:t>HIPAA-compliant</w:t>
-      </w:r>
-      <w:r>
-        <w:rPr>
-          <w:b w:val="0"/>
-          <w:i w:val="0"/>
-          <w:sz w:val="22"/>
-        </w:rPr>
-        <w:t xml:space="preserve"> data exchange for a U.S. healthcare client.</w:t>
+        </w:rPr>
+        <w:t xml:space="preserve">| </w:t>
+      </w:r>
+      <w:r>
+        <w:rPr>
+          <w:b/>
+          <w:i/>
+        </w:rPr>
+        <w:t>Python Developer (Client: Accenture)</w:t>
+      </w:r>
+      <w:r>
+        <w:rPr>
+          <w:b/>
+        </w:rPr>
+        <w:tab/>
+        <w:t>India | January 2019 – August 2023</w:t>
       </w:r>
     </w:p>
     <w:p>
@@ -1651,7 +1676,7 @@
           <w:i w:val="0"/>
           <w:sz w:val="22"/>
         </w:rPr>
-        <w:t xml:space="preserve">Enhanced </w:t>
+        <w:t xml:space="preserve">Developed </w:t>
       </w:r>
       <w:r>
         <w:rPr>
@@ -1659,7 +1684,7 @@
           <w:i w:val="0"/>
           <w:sz w:val="22"/>
         </w:rPr>
-        <w:t>job scheduling and queuing</w:t>
+        <w:t>RESTful microservices</w:t>
       </w:r>
       <w:r>
         <w:rPr>
@@ -1667,7 +1692,7 @@
           <w:i w:val="0"/>
           <w:sz w:val="22"/>
         </w:rPr>
-        <w:t xml:space="preserve"> in </w:t>
+        <w:t xml:space="preserve"> with </w:t>
       </w:r>
       <w:r>
         <w:rPr>
@@ -1675,7 +1700,7 @@
           <w:i w:val="0"/>
           <w:sz w:val="22"/>
         </w:rPr>
-        <w:t>Apache Airflow</w:t>
+        <w:t>OAuth 2.0</w:t>
       </w:r>
       <w:r>
         <w:rPr>
@@ -1683,7 +1708,7 @@
           <w:i w:val="0"/>
           <w:sz w:val="22"/>
         </w:rPr>
-        <w:t xml:space="preserve">, configuring DAG priority weights, pools, and concurrency limits to support </w:t>
+        <w:t xml:space="preserve"> authorization and </w:t>
       </w:r>
       <w:r>
         <w:rPr>
@@ -1691,7 +1716,7 @@
           <w:i w:val="0"/>
           <w:sz w:val="22"/>
         </w:rPr>
-        <w:t>concurrent execution, prioritization, and efficient resource allocation</w:t>
+        <w:t>API versioning</w:t>
       </w:r>
       <w:r>
         <w:rPr>
@@ -1699,7 +1724,7 @@
           <w:i w:val="0"/>
           <w:sz w:val="22"/>
         </w:rPr>
-        <w:t xml:space="preserve">, reducing manual effort by </w:t>
+        <w:t xml:space="preserve"> for secure enterprise system communication, supporting </w:t>
       </w:r>
       <w:r>
         <w:rPr>
@@ -1707,7 +1732,23 @@
           <w:i w:val="0"/>
           <w:sz w:val="22"/>
         </w:rPr>
-        <w:t>25%</w:t>
+        <w:t>HIPAA-compliant</w:t>
+      </w:r>
+      <w:r>
+        <w:rPr>
+          <w:b w:val="0"/>
+          <w:i w:val="0"/>
+          <w:sz w:val="22"/>
+        </w:rPr>
+        <w:t xml:space="preserve"> data exchange and real-time </w:t>
+      </w:r>
+      <w:r>
+        <w:rPr>
+          <w:b/>
+          <w:i w:val="0"/>
+          <w:sz w:val="22"/>
+        </w:rPr>
+        <w:t>EHR integration</w:t>
       </w:r>
       <w:r>
         <w:rPr>
@@ -1740,7 +1781,7 @@
           <w:i w:val="0"/>
           <w:sz w:val="22"/>
         </w:rPr>
-        <w:t xml:space="preserve">Streamlined </w:t>
+        <w:t xml:space="preserve">Designed and optimized </w:t>
       </w:r>
       <w:r>
         <w:rPr>
@@ -1748,7 +1789,7 @@
           <w:i w:val="0"/>
           <w:sz w:val="22"/>
         </w:rPr>
-        <w:t>end-to-end workflows</w:t>
+        <w:t>20+ data pipelines</w:t>
       </w:r>
       <w:r>
         <w:rPr>
@@ -1756,7 +1797,7 @@
           <w:i w:val="0"/>
           <w:sz w:val="22"/>
         </w:rPr>
-        <w:t xml:space="preserve"> by identifying bottlenecks and </w:t>
+        <w:t xml:space="preserve"> for provider and consumer analytics, orchestrated with </w:t>
       </w:r>
       <w:r>
         <w:rPr>
@@ -1764,7 +1805,7 @@
           <w:i w:val="0"/>
           <w:sz w:val="22"/>
         </w:rPr>
-        <w:t>refactoring orchestration and dependency logic</w:t>
+        <w:t>Apache Airflow DAGs</w:t>
       </w:r>
       <w:r>
         <w:rPr>
@@ -1772,7 +1813,7 @@
           <w:i w:val="0"/>
           <w:sz w:val="22"/>
         </w:rPr>
-        <w:t xml:space="preserve">, improving coordination across ingestion, processing, and serving components and reducing project turnaround time by </w:t>
+        <w:t xml:space="preserve"> and </w:t>
       </w:r>
       <w:r>
         <w:rPr>
@@ -1780,7 +1821,39 @@
           <w:i w:val="0"/>
           <w:sz w:val="22"/>
         </w:rPr>
-        <w:t>15%</w:t>
+        <w:t>CI/CD</w:t>
+      </w:r>
+      <w:r>
+        <w:rPr>
+          <w:b w:val="0"/>
+          <w:i w:val="0"/>
+          <w:sz w:val="22"/>
+        </w:rPr>
+        <w:t xml:space="preserve"> on </w:t>
+      </w:r>
+      <w:r>
+        <w:rPr>
+          <w:b/>
+          <w:i w:val="0"/>
+          <w:sz w:val="22"/>
+        </w:rPr>
+        <w:t>AWS</w:t>
+      </w:r>
+      <w:r>
+        <w:rPr>
+          <w:b w:val="0"/>
+          <w:i w:val="0"/>
+          <w:sz w:val="22"/>
+        </w:rPr>
+        <w:t xml:space="preserve">, scheduling ingestion, feature engineering, and retraining jobs and reducing manual effort by </w:t>
+      </w:r>
+      <w:r>
+        <w:rPr>
+          <w:b/>
+          <w:i w:val="0"/>
+          <w:sz w:val="22"/>
+        </w:rPr>
+        <w:t>25%</w:t>
       </w:r>
       <w:r>
         <w:rPr>
@@ -1809,11 +1882,19 @@
       </w:r>
       <w:r>
         <w:rPr>
+          <w:b w:val="0"/>
+          <w:i w:val="0"/>
+          <w:sz w:val="22"/>
+        </w:rPr>
+        <w:t xml:space="preserve">Streamlined </w:t>
+      </w:r>
+      <w:r>
+        <w:rPr>
           <w:b/>
           <w:i w:val="0"/>
           <w:sz w:val="22"/>
         </w:rPr>
-        <w:t>Profiled and optimized long-running distributed workloads</w:t>
+        <w:t>end-to-end ingestion workflows</w:t>
       </w:r>
       <w:r>
         <w:rPr>
@@ -1821,7 +1902,7 @@
           <w:i w:val="0"/>
           <w:sz w:val="22"/>
         </w:rPr>
-        <w:t xml:space="preserve"> by migrating from </w:t>
+        <w:t xml:space="preserve"> by building </w:t>
       </w:r>
       <w:r>
         <w:rPr>
@@ -1829,7 +1910,7 @@
           <w:i w:val="0"/>
           <w:sz w:val="22"/>
         </w:rPr>
-        <w:t>Hive to Apache Spark/PySpark</w:t>
+        <w:t>Python</w:t>
       </w:r>
       <w:r>
         <w:rPr>
@@ -1837,7 +1918,39 @@
           <w:i w:val="0"/>
           <w:sz w:val="22"/>
         </w:rPr>
-        <w:t xml:space="preserve"> and tuning partitioning, caching, and executor resource allocation, significantly reducing processing time and increasing throughput.</w:t>
+        <w:t xml:space="preserve"> automation for </w:t>
+      </w:r>
+      <w:r>
+        <w:rPr>
+          <w:b/>
+          <w:i w:val="0"/>
+          <w:sz w:val="22"/>
+        </w:rPr>
+        <w:t>NPPES</w:t>
+      </w:r>
+      <w:r>
+        <w:rPr>
+          <w:b w:val="0"/>
+          <w:i w:val="0"/>
+          <w:sz w:val="22"/>
+        </w:rPr>
+        <w:t xml:space="preserve"> provider data, improving data accuracy by </w:t>
+      </w:r>
+      <w:r>
+        <w:rPr>
+          <w:b/>
+          <w:i w:val="0"/>
+          <w:sz w:val="22"/>
+        </w:rPr>
+        <w:t>74%</w:t>
+      </w:r>
+      <w:r>
+        <w:rPr>
+          <w:b w:val="0"/>
+          <w:i w:val="0"/>
+          <w:sz w:val="22"/>
+        </w:rPr>
+        <w:t xml:space="preserve"> and reducing processing overhead in claims-balancing workflows.</w:t>
       </w:r>
     </w:p>
     <w:p>
@@ -1858,11 +1971,19 @@
       </w:r>
       <w:r>
         <w:rPr>
+          <w:b/>
+          <w:i w:val="0"/>
+          <w:sz w:val="22"/>
+        </w:rPr>
+        <w:t>Profiled and optimized</w:t>
+      </w:r>
+      <w:r>
+        <w:rPr>
           <w:b w:val="0"/>
           <w:i w:val="0"/>
           <w:sz w:val="22"/>
         </w:rPr>
-        <w:t xml:space="preserve">Built scalable </w:t>
+        <w:t xml:space="preserve"> large-scale processing by migrating from </w:t>
       </w:r>
       <w:r>
         <w:rPr>
@@ -1870,7 +1991,7 @@
           <w:i w:val="0"/>
           <w:sz w:val="22"/>
         </w:rPr>
-        <w:t>distributed data-processing pipelines</w:t>
+        <w:t>Hive to Apache Spark/PySpark</w:t>
       </w:r>
       <w:r>
         <w:rPr>
@@ -1878,7 +1999,7 @@
           <w:i w:val="0"/>
           <w:sz w:val="22"/>
         </w:rPr>
-        <w:t xml:space="preserve"> using </w:t>
+        <w:t xml:space="preserve"> and re-engineering </w:t>
       </w:r>
       <w:r>
         <w:rPr>
@@ -1886,7 +2007,7 @@
           <w:i w:val="0"/>
           <w:sz w:val="22"/>
         </w:rPr>
-        <w:t>PySpark</w:t>
+        <w:t>SQL</w:t>
       </w:r>
       <w:r>
         <w:rPr>
@@ -1894,7 +2015,7 @@
           <w:i w:val="0"/>
           <w:sz w:val="22"/>
         </w:rPr>
-        <w:t xml:space="preserve"> and </w:t>
+        <w:t xml:space="preserve"> feature pipelines, boosting model-training efficiency by </w:t>
       </w:r>
       <w:r>
         <w:rPr>
@@ -1902,7 +2023,7 @@
           <w:i w:val="0"/>
           <w:sz w:val="22"/>
         </w:rPr>
-        <w:t>AWS (S3, Glue, SageMaker)</w:t>
+        <w:t>60%</w:t>
       </w:r>
       <w:r>
         <w:rPr>
@@ -1910,7 +2031,7 @@
           <w:i w:val="0"/>
           <w:sz w:val="22"/>
         </w:rPr>
-        <w:t xml:space="preserve"> with </w:t>
+        <w:t xml:space="preserve"> and cutting preprocessing overhead by </w:t>
       </w:r>
       <w:r>
         <w:rPr>
@@ -1918,7 +2039,7 @@
           <w:i w:val="0"/>
           <w:sz w:val="22"/>
         </w:rPr>
-        <w:t>Delta Lake</w:t>
+        <w:t>70%</w:t>
       </w:r>
       <w:r>
         <w:rPr>
@@ -1926,23 +2047,7 @@
           <w:i w:val="0"/>
           <w:sz w:val="22"/>
         </w:rPr>
-        <w:t xml:space="preserve">, improving data reliability by </w:t>
-      </w:r>
-      <w:r>
-        <w:rPr>
-          <w:b/>
-          <w:i w:val="0"/>
-          <w:sz w:val="22"/>
-        </w:rPr>
-        <w:t>30%</w:t>
-      </w:r>
-      <w:r>
-        <w:rPr>
-          <w:b w:val="0"/>
-          <w:i w:val="0"/>
-          <w:sz w:val="22"/>
-        </w:rPr>
-        <w:t xml:space="preserve"> across ingestion and processing stages.</w:t>
+        <w:t>.</w:t>
       </w:r>
     </w:p>
     <w:p>
@@ -1967,7 +2072,7 @@
           <w:i w:val="0"/>
           <w:sz w:val="22"/>
         </w:rPr>
-        <w:t xml:space="preserve">Developed </w:t>
+        <w:t xml:space="preserve">Built scalable </w:t>
       </w:r>
       <w:r>
         <w:rPr>
@@ -1975,7 +2080,7 @@
           <w:i w:val="0"/>
           <w:sz w:val="22"/>
         </w:rPr>
-        <w:t>performance metrics and statistics</w:t>
+        <w:t>distributed ETL pipelines</w:t>
       </w:r>
       <w:r>
         <w:rPr>
@@ -1983,7 +2088,7 @@
           <w:i w:val="0"/>
           <w:sz w:val="22"/>
         </w:rPr>
-        <w:t xml:space="preserve"> dashboards using </w:t>
+        <w:t xml:space="preserve"> with </w:t>
       </w:r>
       <w:r>
         <w:rPr>
@@ -1991,7 +2096,7 @@
           <w:i w:val="0"/>
           <w:sz w:val="22"/>
         </w:rPr>
-        <w:t>Azure Stream Analytics</w:t>
+        <w:t>PySpark, AWS (S3, Glue, SageMaker)</w:t>
       </w:r>
       <w:r>
         <w:rPr>
@@ -1999,7 +2104,7 @@
           <w:i w:val="0"/>
           <w:sz w:val="22"/>
         </w:rPr>
-        <w:t xml:space="preserve"> and </w:t>
+        <w:t xml:space="preserve">, and </w:t>
       </w:r>
       <w:r>
         <w:rPr>
@@ -2007,7 +2112,7 @@
           <w:i w:val="0"/>
           <w:sz w:val="22"/>
         </w:rPr>
-        <w:t>Power BI</w:t>
+        <w:t>Delta Lake</w:t>
       </w:r>
       <w:r>
         <w:rPr>
@@ -2015,7 +2120,7 @@
           <w:i w:val="0"/>
           <w:sz w:val="22"/>
         </w:rPr>
-        <w:t xml:space="preserve"> to monitor pipeline throughput and system health, reducing unplanned downtime by </w:t>
+        <w:t xml:space="preserve">, and web crawlers that structured </w:t>
       </w:r>
       <w:r>
         <w:rPr>
@@ -2023,7 +2128,23 @@
           <w:i w:val="0"/>
           <w:sz w:val="22"/>
         </w:rPr>
-        <w:t>20%</w:t>
+        <w:t>400,000+</w:t>
+      </w:r>
+      <w:r>
+        <w:rPr>
+          <w:b w:val="0"/>
+          <w:i w:val="0"/>
+          <w:sz w:val="22"/>
+        </w:rPr>
+        <w:t xml:space="preserve"> XML/JSON documents, improving data reliability by </w:t>
+      </w:r>
+      <w:r>
+        <w:rPr>
+          <w:b/>
+          <w:i w:val="0"/>
+          <w:sz w:val="22"/>
+        </w:rPr>
+        <w:t>30%</w:t>
       </w:r>
       <w:r>
         <w:rPr>
@@ -2056,7 +2177,7 @@
           <w:i w:val="0"/>
           <w:sz w:val="22"/>
         </w:rPr>
-        <w:t xml:space="preserve">Containerized and orchestrated Python services using </w:t>
+        <w:t xml:space="preserve">Containerized and deployed Python services using </w:t>
       </w:r>
       <w:r>
         <w:rPr>
@@ -2064,7 +2185,7 @@
           <w:i w:val="0"/>
           <w:sz w:val="22"/>
         </w:rPr>
-        <w:t>Docker</w:t>
+        <w:t>Docker, Kubernetes, and Jenkins CI/CD</w:t>
       </w:r>
       <w:r>
         <w:rPr>
@@ -2072,7 +2193,7 @@
           <w:i w:val="0"/>
           <w:sz w:val="22"/>
         </w:rPr>
-        <w:t xml:space="preserve"> and </w:t>
+        <w:t xml:space="preserve">, improving system uptime by </w:t>
       </w:r>
       <w:r>
         <w:rPr>
@@ -2080,55 +2201,7 @@
           <w:i w:val="0"/>
           <w:sz w:val="22"/>
         </w:rPr>
-        <w:t>Kubernetes</w:t>
-      </w:r>
-      <w:r>
-        <w:rPr>
-          <w:b w:val="0"/>
-          <w:i w:val="0"/>
-          <w:sz w:val="22"/>
-        </w:rPr>
-        <w:t xml:space="preserve"> with </w:t>
-      </w:r>
-      <w:r>
-        <w:rPr>
-          <w:b/>
-          <w:i w:val="0"/>
-          <w:sz w:val="22"/>
-        </w:rPr>
-        <w:t>Jenkins CI/CD</w:t>
-      </w:r>
-      <w:r>
-        <w:rPr>
-          <w:b w:val="0"/>
-          <w:i w:val="0"/>
-          <w:sz w:val="22"/>
-        </w:rPr>
-        <w:t xml:space="preserve">, improving system uptime by </w:t>
-      </w:r>
-      <w:r>
-        <w:rPr>
-          <w:b/>
-          <w:i w:val="0"/>
-          <w:sz w:val="22"/>
-        </w:rPr>
         <w:t>20%</w:t>
-      </w:r>
-      <w:r>
-        <w:rPr>
-          <w:b w:val="0"/>
-          <w:i w:val="0"/>
-          <w:sz w:val="22"/>
-        </w:rPr>
-        <w:t xml:space="preserve"> and enabling real-time EHR integration via </w:t>
-      </w:r>
-      <w:r>
-        <w:rPr>
-          <w:b/>
-          <w:i w:val="0"/>
-          <w:sz w:val="22"/>
-        </w:rPr>
-        <w:t>REST APIs</w:t>
       </w:r>
       <w:r>
         <w:rPr>
@@ -2161,7 +2234,7 @@
           <w:i w:val="0"/>
           <w:sz w:val="22"/>
         </w:rPr>
-        <w:t xml:space="preserve">Developed high-throughput </w:t>
+        <w:t xml:space="preserve">Developed </w:t>
       </w:r>
       <w:r>
         <w:rPr>
@@ -2169,7 +2242,7 @@
           <w:i w:val="0"/>
           <w:sz w:val="22"/>
         </w:rPr>
-        <w:t>Python/Java</w:t>
+        <w:t>Tableau</w:t>
       </w:r>
       <w:r>
         <w:rPr>
@@ -2177,7 +2250,7 @@
           <w:i w:val="0"/>
           <w:sz w:val="22"/>
         </w:rPr>
-        <w:t xml:space="preserve"> services, including </w:t>
+        <w:t xml:space="preserve"> and </w:t>
       </w:r>
       <w:r>
         <w:rPr>
@@ -2185,7 +2258,7 @@
           <w:i w:val="0"/>
           <w:sz w:val="22"/>
         </w:rPr>
-        <w:t>BERT/BioBERT</w:t>
+        <w:t>Power BI</w:t>
       </w:r>
       <w:r>
         <w:rPr>
@@ -2193,7 +2266,7 @@
           <w:i w:val="0"/>
           <w:sz w:val="22"/>
         </w:rPr>
-        <w:t xml:space="preserve"> clinical entity extraction (</w:t>
+        <w:t xml:space="preserve"> dashboards and a real-time </w:t>
       </w:r>
       <w:r>
         <w:rPr>
@@ -2201,7 +2274,7 @@
           <w:i w:val="0"/>
           <w:sz w:val="22"/>
         </w:rPr>
-        <w:t>80% accuracy</w:t>
+        <w:t>Azure Stream Analytics</w:t>
       </w:r>
       <w:r>
         <w:rPr>
@@ -2209,7 +2282,7 @@
           <w:i w:val="0"/>
           <w:sz w:val="22"/>
         </w:rPr>
-        <w:t xml:space="preserve">, </w:t>
+        <w:t xml:space="preserve"> pipeline surfacing </w:t>
       </w:r>
       <w:r>
         <w:rPr>
@@ -2217,7 +2290,7 @@
           <w:i w:val="0"/>
           <w:sz w:val="22"/>
         </w:rPr>
-        <w:t>55%</w:t>
+        <w:t>performance metrics</w:t>
       </w:r>
       <w:r>
         <w:rPr>
@@ -2225,7 +2298,7 @@
           <w:i w:val="0"/>
           <w:sz w:val="22"/>
         </w:rPr>
-        <w:t xml:space="preserve"> faster processing) and fault-tolerant </w:t>
+        <w:t xml:space="preserve"> and anomalies for IoT sensor data, reducing unplanned downtime by </w:t>
       </w:r>
       <w:r>
         <w:rPr>
@@ -2233,7 +2306,7 @@
           <w:i w:val="0"/>
           <w:sz w:val="22"/>
         </w:rPr>
-        <w:t>MongoDB</w:t>
+        <w:t>20%</w:t>
       </w:r>
       <w:r>
         <w:rPr>
@@ -2241,7 +2314,7 @@
           <w:i w:val="0"/>
           <w:sz w:val="22"/>
         </w:rPr>
-        <w:t xml:space="preserve"> data models for unstructured data.</w:t>
+        <w:t>.</w:t>
       </w:r>
     </w:p>
     <w:p>
@@ -2266,7 +2339,7 @@
           <w:i w:val="0"/>
           <w:sz w:val="22"/>
         </w:rPr>
-        <w:t xml:space="preserve">Collaborated with engineering, product, and </w:t>
+        <w:t xml:space="preserve">Delivered </w:t>
       </w:r>
       <w:r>
         <w:rPr>
@@ -2274,7 +2347,7 @@
           <w:i w:val="0"/>
           <w:sz w:val="22"/>
         </w:rPr>
-        <w:t>Accenture</w:t>
+        <w:t>BERT/BioBERT</w:t>
       </w:r>
       <w:r>
         <w:rPr>
@@ -2282,7 +2355,7 @@
           <w:i w:val="0"/>
           <w:sz w:val="22"/>
         </w:rPr>
-        <w:t xml:space="preserve"> client teams in </w:t>
+        <w:t xml:space="preserve"> clinical entity extraction (</w:t>
       </w:r>
       <w:r>
         <w:rPr>
@@ -2290,7 +2363,7 @@
           <w:i w:val="0"/>
           <w:sz w:val="22"/>
         </w:rPr>
-        <w:t>technical design discussions</w:t>
+        <w:t>80% accuracy</w:t>
       </w:r>
       <w:r>
         <w:rPr>
@@ -2298,7 +2371,7 @@
           <w:i w:val="0"/>
           <w:sz w:val="22"/>
         </w:rPr>
-        <w:t xml:space="preserve"> and </w:t>
+        <w:t xml:space="preserve">, </w:t>
       </w:r>
       <w:r>
         <w:rPr>
@@ -2306,7 +2379,7 @@
           <w:i w:val="0"/>
           <w:sz w:val="22"/>
         </w:rPr>
-        <w:t>code reviews</w:t>
+        <w:t>55%</w:t>
       </w:r>
       <w:r>
         <w:rPr>
@@ -2314,7 +2387,7 @@
           <w:i w:val="0"/>
           <w:sz w:val="22"/>
         </w:rPr>
-        <w:t xml:space="preserve">, and contributed </w:t>
+        <w:t xml:space="preserve"> faster processing) and rule-based invoice classification that reduced manual error rates by </w:t>
       </w:r>
       <w:r>
         <w:rPr>
@@ -2322,7 +2395,7 @@
           <w:i w:val="0"/>
           <w:sz w:val="22"/>
         </w:rPr>
-        <w:t>technical documentation</w:t>
+        <w:t>70%</w:t>
       </w:r>
       <w:r>
         <w:rPr>
@@ -2330,7 +2403,112 @@
           <w:i w:val="0"/>
           <w:sz w:val="22"/>
         </w:rPr>
-        <w:t xml:space="preserve"> and engineering best practices.</w:t>
+        <w:t xml:space="preserve">; designed </w:t>
+      </w:r>
+      <w:r>
+        <w:rPr>
+          <w:b/>
+          <w:i w:val="0"/>
+          <w:sz w:val="22"/>
+        </w:rPr>
+        <w:t>MongoDB</w:t>
+      </w:r>
+      <w:r>
+        <w:rPr>
+          <w:b w:val="0"/>
+          <w:i w:val="0"/>
+          <w:sz w:val="22"/>
+        </w:rPr>
+        <w:t xml:space="preserve"> models for high-throughput sensor data.</w:t>
+      </w:r>
+    </w:p>
+    <w:p>
+      <w:pPr>
+        <w:tabs>
+          <w:tab w:pos="475" w:val="left"/>
+        </w:tabs>
+        <w:spacing w:after="20"/>
+        <w:ind w:left="475" w:hanging="331"/>
+        <w:jc w:val="both"/>
+      </w:pPr>
+      <w:r>
+        <w:rPr>
+          <w:sz w:val="22"/>
+        </w:rPr>
+        <w:t>•</w:t>
+        <w:tab/>
+      </w:r>
+      <w:r>
+        <w:rPr>
+          <w:b w:val="0"/>
+          <w:i w:val="0"/>
+          <w:sz w:val="22"/>
+        </w:rPr>
+        <w:t xml:space="preserve">Collaborated with cross-functional teams and </w:t>
+      </w:r>
+      <w:r>
+        <w:rPr>
+          <w:b/>
+          <w:i w:val="0"/>
+          <w:sz w:val="22"/>
+        </w:rPr>
+        <w:t>Accenture</w:t>
+      </w:r>
+      <w:r>
+        <w:rPr>
+          <w:b w:val="0"/>
+          <w:i w:val="0"/>
+          <w:sz w:val="22"/>
+        </w:rPr>
+        <w:t xml:space="preserve"> client stakeholders on the </w:t>
+      </w:r>
+      <w:r>
+        <w:rPr>
+          <w:b/>
+          <w:i w:val="0"/>
+          <w:sz w:val="22"/>
+        </w:rPr>
+        <w:t>Seven Plus Locations</w:t>
+      </w:r>
+      <w:r>
+        <w:rPr>
+          <w:b w:val="0"/>
+          <w:i w:val="0"/>
+          <w:sz w:val="22"/>
+        </w:rPr>
+        <w:t xml:space="preserve"> project through </w:t>
+      </w:r>
+      <w:r>
+        <w:rPr>
+          <w:b/>
+          <w:i w:val="0"/>
+          <w:sz w:val="22"/>
+        </w:rPr>
+        <w:t>technical design discussions and code reviews</w:t>
+      </w:r>
+      <w:r>
+        <w:rPr>
+          <w:b w:val="0"/>
+          <w:i w:val="0"/>
+          <w:sz w:val="22"/>
+        </w:rPr>
+        <w:t xml:space="preserve">, reducing project turnaround time by </w:t>
+      </w:r>
+      <w:r>
+        <w:rPr>
+          <w:b/>
+          <w:i w:val="0"/>
+          <w:sz w:val="22"/>
+        </w:rPr>
+        <w:t>15%</w:t>
+      </w:r>
+      <w:r>
+        <w:rPr>
+          <w:b w:val="0"/>
+          <w:i w:val="0"/>
+          <w:sz w:val="22"/>
+        </w:rPr>
+        <w:t>.</w:t>
       </w:r>
     </w:p>
     <w:sectPr>

</xml_diff>